<commit_message>
Add Section 2 (Scope & focus) to methodology: layers, plasma provenance, questions
Explains in plain terms what the model focuses on (plasma immune proteins as
the molecular core), the five layers it connects (transcript, DNA, cell source,
phenome, translational), which parts are plasma-derived vs not, and a concrete
list of the questions the causal atlas and the trained PIRS can answer.

Co-Authored-By: Claude Opus 4.6 <noreply@anthropic.com>
</commit_message>
<xml_diff>
--- a/manuscript/PIRS_and_Atlas_Methodology.docx
+++ b/manuscript/PIRS_and_Atlas_Methodology.docx
@@ -185,7 +185,940 @@
           <w:i w:val="0"/>
           <w:sz w:val="21"/>
         </w:rPr>
-        <w:t>The document is organised as a narrative arc. Part A describes the data. Part B describes how the immune proteome was defined. Part C–F describe the causal-inference engine (instruments, Mendelian randomization, colocalization, protein-level validation, replication). Part G describes the pan-phenome expansion and the novelty-priority engine. Part H is the PIRS model in full: data → features → algorithm → training → scoring. Part I explains why one would train with the model, what questions it answers, and how a research programme benefits. Part J covers limitations, reproducibility, a glossary and references.</w:t>
+        <w:t>The document is organised as a narrative arc. Section 2 defines the model’s scope, its layers and which parts are plasma-derived. Part A describes the data. Part B describes how the immune proteome was defined. Part C–F describe the causal-inference engine (instruments, Mendelian randomization, colocalization, protein-level validation, replication). Part G describes the pan-phenome expansion and the novelty-priority engine. Part H is the PIRS model in full: data → features → algorithm → training → scoring. Part I explains why one would train with the model, what questions it answers, and how a research programme benefits. Part J covers limitations, reproducibility, a glossary and references.</w:t>
+      </w:r>
+    </w:p>
+    <w:p>
+      <w:r>
+        <w:br w:type="page"/>
+      </w:r>
+    </w:p>
+    <w:p>
+      <w:pPr>
+        <w:pStyle w:val="Heading1"/>
+      </w:pPr>
+      <w:r>
+        <w:rPr>
+          <w:color w:val="1F4E79"/>
+        </w:rPr>
+        <w:t>2.  What this model focuses on (scope, layers and data provenance)</w:t>
+      </w:r>
+    </w:p>
+    <w:p>
+      <w:r>
+        <w:rPr>
+          <w:b w:val="0"/>
+          <w:i w:val="0"/>
+          <w:sz w:val="21"/>
+        </w:rPr>
+        <w:t>Because the resource joins several kinds of data, it is important to state plainly what it is about, what it is not about, and — since the word “plasma” appears throughout — exactly which parts are plasma-derived and which are not. This section is written for readers who want to understand the resource before the technical detail.</w:t>
+      </w:r>
+    </w:p>
+    <w:p>
+      <w:pPr>
+        <w:pStyle w:val="Heading2"/>
+      </w:pPr>
+      <w:r>
+        <w:rPr>
+          <w:color w:val="2E629E"/>
+        </w:rPr>
+        <w:t>2.1  The core object: circulating plasma immune proteins</w:t>
+      </w:r>
+    </w:p>
+    <w:p>
+      <w:r>
+        <w:rPr>
+          <w:b w:val="0"/>
+          <w:i w:val="0"/>
+          <w:sz w:val="21"/>
+        </w:rPr>
+        <w:t>The subject of the model is molecular, and specifically it is the plasma (blood-circulating) immune proteome — the set of immune-related proteins that are measurable in blood. Concretely this is the 1,007-protein plasma immunome curated from the Olink Explore panel. This is what the model measures, what the Plasma Immune Risk Score (PIRS) is trained on, and what is ultimately nominated as a therapeutic target. The model is NOT about the whole proteome, and it is NOT about other molecular layers such as metabolites, lipids or intracellular/tissue proteins; it is deliberately restricted to the circulating, secreted immune protein subset.</w:t>
+      </w:r>
+    </w:p>
+    <w:p>
+      <w:pPr>
+        <w:pStyle w:val="Heading2"/>
+      </w:pPr>
+      <w:r>
+        <w:rPr>
+          <w:color w:val="2E629E"/>
+        </w:rPr>
+        <w:t>2.2  The layers the model connects</w:t>
+      </w:r>
+    </w:p>
+    <w:p>
+      <w:r>
+        <w:rPr>
+          <w:b w:val="0"/>
+          <w:i w:val="0"/>
+          <w:sz w:val="21"/>
+        </w:rPr>
+        <w:t>Around that molecular core, the resource deliberately links five further layers, so that a plasma protein is never viewed in isolation but always in relation to its cause, its cellular origin, and its disease consequence. The model’s focus is best understood as a bridge from molecule to disease:</w:t>
+      </w:r>
+    </w:p>
+    <w:tbl>
+      <w:tblPr>
+        <w:tblStyle w:val="LightGrid-Accent1"/>
+        <w:tblW w:type="auto" w:w="0"/>
+        <w:tblLook w:firstColumn="1" w:firstRow="1" w:lastColumn="0" w:lastRow="0" w:noHBand="0" w:noVBand="1" w:val="04A0"/>
+      </w:tblPr>
+      <w:tblGrid>
+        <w:gridCol w:w="2880"/>
+        <w:gridCol w:w="2880"/>
+        <w:gridCol w:w="2880"/>
+      </w:tblGrid>
+      <w:tr>
+        <w:tc>
+          <w:tcPr>
+            <w:tcW w:type="dxa" w:w="2880"/>
+          </w:tcPr>
+          <w:p>
+            <w:r>
+              <w:rPr>
+                <w:b/>
+                <w:sz w:val="17"/>
+              </w:rPr>
+              <w:t>Focus / layer</w:t>
+            </w:r>
+          </w:p>
+        </w:tc>
+        <w:tc>
+          <w:tcPr>
+            <w:tcW w:type="dxa" w:w="2880"/>
+          </w:tcPr>
+          <w:p>
+            <w:r>
+              <w:rPr>
+                <w:b/>
+                <w:sz w:val="17"/>
+              </w:rPr>
+              <w:t>Level</w:t>
+            </w:r>
+          </w:p>
+        </w:tc>
+        <w:tc>
+          <w:tcPr>
+            <w:tcW w:type="dxa" w:w="2880"/>
+          </w:tcPr>
+          <w:p>
+            <w:r>
+              <w:rPr>
+                <w:b/>
+                <w:sz w:val="17"/>
+              </w:rPr>
+              <w:t>What it contributes to the model</w:t>
+            </w:r>
+          </w:p>
+        </w:tc>
+      </w:tr>
+      <w:tr>
+        <w:tc>
+          <w:tcPr>
+            <w:tcW w:type="dxa" w:w="2880"/>
+          </w:tcPr>
+          <w:p>
+            <w:r>
+              <w:rPr>
+                <w:sz w:val="17"/>
+              </w:rPr>
+              <w:t>Plasma immune protein</w:t>
+            </w:r>
+          </w:p>
+        </w:tc>
+        <w:tc>
+          <w:tcPr>
+            <w:tcW w:type="dxa" w:w="2880"/>
+          </w:tcPr>
+          <w:p>
+            <w:r>
+              <w:rPr>
+                <w:sz w:val="17"/>
+              </w:rPr>
+              <w:t>molecular — protein</w:t>
+            </w:r>
+          </w:p>
+        </w:tc>
+        <w:tc>
+          <w:tcPr>
+            <w:tcW w:type="dxa" w:w="2880"/>
+          </w:tcPr>
+          <w:p>
+            <w:r>
+              <w:rPr>
+                <w:sz w:val="17"/>
+              </w:rPr>
+              <w:t>the CORE: measured features, PIRS inputs, nominated targets</w:t>
+            </w:r>
+          </w:p>
+        </w:tc>
+      </w:tr>
+      <w:tr>
+        <w:tc>
+          <w:tcPr>
+            <w:tcW w:type="dxa" w:w="2880"/>
+          </w:tcPr>
+          <w:p>
+            <w:r>
+              <w:rPr>
+                <w:sz w:val="17"/>
+              </w:rPr>
+              <w:t>Blood gene expression</w:t>
+            </w:r>
+          </w:p>
+        </w:tc>
+        <w:tc>
+          <w:tcPr>
+            <w:tcW w:type="dxa" w:w="2880"/>
+          </w:tcPr>
+          <w:p>
+            <w:r>
+              <w:rPr>
+                <w:sz w:val="17"/>
+              </w:rPr>
+              <w:t>molecular — transcript (eQTL)</w:t>
+            </w:r>
+          </w:p>
+        </w:tc>
+        <w:tc>
+          <w:tcPr>
+            <w:tcW w:type="dxa" w:w="2880"/>
+          </w:tcPr>
+          <w:p>
+            <w:r>
+              <w:rPr>
+                <w:sz w:val="17"/>
+              </w:rPr>
+              <w:t>the causal instrument (why a protein moves disease risk)</w:t>
+            </w:r>
+          </w:p>
+        </w:tc>
+      </w:tr>
+      <w:tr>
+        <w:tc>
+          <w:tcPr>
+            <w:tcW w:type="dxa" w:w="2880"/>
+          </w:tcPr>
+          <w:p>
+            <w:r>
+              <w:rPr>
+                <w:sz w:val="17"/>
+              </w:rPr>
+              <w:t>Germline genetics</w:t>
+            </w:r>
+          </w:p>
+        </w:tc>
+        <w:tc>
+          <w:tcPr>
+            <w:tcW w:type="dxa" w:w="2880"/>
+          </w:tcPr>
+          <w:p>
+            <w:r>
+              <w:rPr>
+                <w:sz w:val="17"/>
+              </w:rPr>
+              <w:t>molecular — DNA variants (GWAS)</w:t>
+            </w:r>
+          </w:p>
+        </w:tc>
+        <w:tc>
+          <w:tcPr>
+            <w:tcW w:type="dxa" w:w="2880"/>
+          </w:tcPr>
+          <w:p>
+            <w:r>
+              <w:rPr>
+                <w:sz w:val="17"/>
+              </w:rPr>
+              <w:t>the anchor that makes findings causal, not merely correlational</w:t>
+            </w:r>
+          </w:p>
+        </w:tc>
+      </w:tr>
+      <w:tr>
+        <w:tc>
+          <w:tcPr>
+            <w:tcW w:type="dxa" w:w="2880"/>
+          </w:tcPr>
+          <w:p>
+            <w:r>
+              <w:rPr>
+                <w:sz w:val="17"/>
+              </w:rPr>
+              <w:t>Cell of origin</w:t>
+            </w:r>
+          </w:p>
+        </w:tc>
+        <w:tc>
+          <w:tcPr>
+            <w:tcW w:type="dxa" w:w="2880"/>
+          </w:tcPr>
+          <w:p>
+            <w:r>
+              <w:rPr>
+                <w:sz w:val="17"/>
+              </w:rPr>
+              <w:t>cellular</w:t>
+            </w:r>
+          </w:p>
+        </w:tc>
+        <w:tc>
+          <w:tcPr>
+            <w:tcW w:type="dxa" w:w="2880"/>
+          </w:tcPr>
+          <w:p>
+            <w:r>
+              <w:rPr>
+                <w:sz w:val="17"/>
+              </w:rPr>
+              <w:t>maps each protein to its blood-cell lineage (granulocyte/T/B/NK/myeloid)</w:t>
+            </w:r>
+          </w:p>
+        </w:tc>
+      </w:tr>
+      <w:tr>
+        <w:tc>
+          <w:tcPr>
+            <w:tcW w:type="dxa" w:w="2880"/>
+          </w:tcPr>
+          <w:p>
+            <w:r>
+              <w:rPr>
+                <w:sz w:val="17"/>
+              </w:rPr>
+              <w:t>Disease phenome</w:t>
+            </w:r>
+          </w:p>
+        </w:tc>
+        <w:tc>
+          <w:tcPr>
+            <w:tcW w:type="dxa" w:w="2880"/>
+          </w:tcPr>
+          <w:p>
+            <w:r>
+              <w:rPr>
+                <w:sz w:val="17"/>
+              </w:rPr>
+              <w:t>phenotypic — 28 diseases</w:t>
+            </w:r>
+          </w:p>
+        </w:tc>
+        <w:tc>
+          <w:tcPr>
+            <w:tcW w:type="dxa" w:w="2880"/>
+          </w:tcPr>
+          <w:p>
+            <w:r>
+              <w:rPr>
+                <w:sz w:val="17"/>
+              </w:rPr>
+              <w:t>the outcome: what the proteins causally act upon</w:t>
+            </w:r>
+          </w:p>
+        </w:tc>
+      </w:tr>
+      <w:tr>
+        <w:tc>
+          <w:tcPr>
+            <w:tcW w:type="dxa" w:w="2880"/>
+          </w:tcPr>
+          <w:p>
+            <w:r>
+              <w:rPr>
+                <w:sz w:val="17"/>
+              </w:rPr>
+              <w:t>Direction &amp; druggability</w:t>
+            </w:r>
+          </w:p>
+        </w:tc>
+        <w:tc>
+          <w:tcPr>
+            <w:tcW w:type="dxa" w:w="2880"/>
+          </w:tcPr>
+          <w:p>
+            <w:r>
+              <w:rPr>
+                <w:sz w:val="17"/>
+              </w:rPr>
+              <w:t>translational</w:t>
+            </w:r>
+          </w:p>
+        </w:tc>
+        <w:tc>
+          <w:tcPr>
+            <w:tcW w:type="dxa" w:w="2880"/>
+          </w:tcPr>
+          <w:p>
+            <w:r>
+              <w:rPr>
+                <w:sz w:val="17"/>
+              </w:rPr>
+              <w:t>turns a target into block-vs-agonise, modality and novelty rank</w:t>
+            </w:r>
+          </w:p>
+        </w:tc>
+      </w:tr>
+    </w:tbl>
+    <w:p>
+      <w:r>
+        <w:rPr>
+          <w:b w:val="0"/>
+          <w:i w:val="0"/>
+          <w:sz w:val="21"/>
+        </w:rPr>
+        <w:t>In one sentence: the model focuses on plasma immune proteins (molecular), causally linked through genetics (transcript and DNA) to disease (phenotypic), mapped to their cell of origin (cellular), and scored for therapeutic direction and novelty (translational). It is a molecular-to-disease bridge, not a single-source molecular catalogue.</w:t>
+      </w:r>
+    </w:p>
+    <w:p>
+      <w:pPr>
+        <w:pStyle w:val="Heading2"/>
+      </w:pPr>
+      <w:r>
+        <w:rPr>
+          <w:color w:val="2E629E"/>
+        </w:rPr>
+        <w:t>2.3  Which parts are plasma, and which are not</w:t>
+      </w:r>
+    </w:p>
+    <w:p>
+      <w:r>
+        <w:rPr>
+          <w:b w:val="0"/>
+          <w:i w:val="0"/>
+          <w:sz w:val="21"/>
+        </w:rPr>
+        <w:t>The protein and prediction layers are genuinely plasma-derived; the causal-anchor layers are not, and this is by design — causal inference needs a genetic anchor, which cannot come from a plasma protein measurement alone. Stating this honestly prevents the resource from being mistaken for a pure-plasma dataset.</w:t>
+      </w:r>
+    </w:p>
+    <w:tbl>
+      <w:tblPr>
+        <w:tblStyle w:val="LightGrid-Accent1"/>
+        <w:tblW w:type="auto" w:w="0"/>
+        <w:tblLook w:firstColumn="1" w:firstRow="1" w:lastColumn="0" w:lastRow="0" w:noHBand="0" w:noVBand="1" w:val="04A0"/>
+      </w:tblPr>
+      <w:tblGrid>
+        <w:gridCol w:w="2160"/>
+        <w:gridCol w:w="2160"/>
+        <w:gridCol w:w="2160"/>
+        <w:gridCol w:w="2160"/>
+      </w:tblGrid>
+      <w:tr>
+        <w:tc>
+          <w:tcPr>
+            <w:tcW w:type="dxa" w:w="2160"/>
+          </w:tcPr>
+          <w:p>
+            <w:r>
+              <w:rPr>
+                <w:b/>
+                <w:sz w:val="17"/>
+              </w:rPr>
+              <w:t>Layer</w:t>
+            </w:r>
+          </w:p>
+        </w:tc>
+        <w:tc>
+          <w:tcPr>
+            <w:tcW w:type="dxa" w:w="2160"/>
+          </w:tcPr>
+          <w:p>
+            <w:r>
+              <w:rPr>
+                <w:b/>
+                <w:sz w:val="17"/>
+              </w:rPr>
+              <w:t>Source</w:t>
+            </w:r>
+          </w:p>
+        </w:tc>
+        <w:tc>
+          <w:tcPr>
+            <w:tcW w:type="dxa" w:w="2160"/>
+          </w:tcPr>
+          <w:p>
+            <w:r>
+              <w:rPr>
+                <w:b/>
+                <w:sz w:val="17"/>
+              </w:rPr>
+              <w:t>Plasma-derived?</w:t>
+            </w:r>
+          </w:p>
+        </w:tc>
+        <w:tc>
+          <w:tcPr>
+            <w:tcW w:type="dxa" w:w="2160"/>
+          </w:tcPr>
+          <w:p>
+            <w:r>
+              <w:rPr>
+                <w:b/>
+                <w:sz w:val="17"/>
+              </w:rPr>
+              <w:t>Molecular type</w:t>
+            </w:r>
+          </w:p>
+        </w:tc>
+      </w:tr>
+      <w:tr>
+        <w:tc>
+          <w:tcPr>
+            <w:tcW w:type="dxa" w:w="2160"/>
+          </w:tcPr>
+          <w:p>
+            <w:r>
+              <w:rPr>
+                <w:sz w:val="17"/>
+              </w:rPr>
+              <w:t>Protein universe / PIRS features</w:t>
+            </w:r>
+          </w:p>
+        </w:tc>
+        <w:tc>
+          <w:tcPr>
+            <w:tcW w:type="dxa" w:w="2160"/>
+          </w:tcPr>
+          <w:p>
+            <w:r>
+              <w:rPr>
+                <w:sz w:val="17"/>
+              </w:rPr>
+              <w:t>Olink Explore</w:t>
+            </w:r>
+          </w:p>
+        </w:tc>
+        <w:tc>
+          <w:tcPr>
+            <w:tcW w:type="dxa" w:w="2160"/>
+          </w:tcPr>
+          <w:p>
+            <w:r>
+              <w:rPr>
+                <w:sz w:val="17"/>
+              </w:rPr>
+              <w:t>Yes (plasma)</w:t>
+            </w:r>
+          </w:p>
+        </w:tc>
+        <w:tc>
+          <w:tcPr>
+            <w:tcW w:type="dxa" w:w="2160"/>
+          </w:tcPr>
+          <w:p>
+            <w:r>
+              <w:rPr>
+                <w:sz w:val="17"/>
+              </w:rPr>
+              <w:t>protein</w:t>
+            </w:r>
+          </w:p>
+        </w:tc>
+      </w:tr>
+      <w:tr>
+        <w:tc>
+          <w:tcPr>
+            <w:tcW w:type="dxa" w:w="2160"/>
+          </w:tcPr>
+          <w:p>
+            <w:r>
+              <w:rPr>
+                <w:sz w:val="17"/>
+              </w:rPr>
+              <w:t>Protein-level validation</w:t>
+            </w:r>
+          </w:p>
+        </w:tc>
+        <w:tc>
+          <w:tcPr>
+            <w:tcW w:type="dxa" w:w="2160"/>
+          </w:tcPr>
+          <w:p>
+            <w:r>
+              <w:rPr>
+                <w:sz w:val="17"/>
+              </w:rPr>
+              <w:t>INTERVAL cis-pQTL</w:t>
+            </w:r>
+          </w:p>
+        </w:tc>
+        <w:tc>
+          <w:tcPr>
+            <w:tcW w:type="dxa" w:w="2160"/>
+          </w:tcPr>
+          <w:p>
+            <w:r>
+              <w:rPr>
+                <w:sz w:val="17"/>
+              </w:rPr>
+              <w:t>Yes (plasma)</w:t>
+            </w:r>
+          </w:p>
+        </w:tc>
+        <w:tc>
+          <w:tcPr>
+            <w:tcW w:type="dxa" w:w="2160"/>
+          </w:tcPr>
+          <w:p>
+            <w:r>
+              <w:rPr>
+                <w:sz w:val="17"/>
+              </w:rPr>
+              <w:t>protein</w:t>
+            </w:r>
+          </w:p>
+        </w:tc>
+      </w:tr>
+      <w:tr>
+        <w:tc>
+          <w:tcPr>
+            <w:tcW w:type="dxa" w:w="2160"/>
+          </w:tcPr>
+          <w:p>
+            <w:r>
+              <w:rPr>
+                <w:sz w:val="17"/>
+              </w:rPr>
+              <w:t>Causal instrument</w:t>
+            </w:r>
+          </w:p>
+        </w:tc>
+        <w:tc>
+          <w:tcPr>
+            <w:tcW w:type="dxa" w:w="2160"/>
+          </w:tcPr>
+          <w:p>
+            <w:r>
+              <w:rPr>
+                <w:sz w:val="17"/>
+              </w:rPr>
+              <w:t>eQTLGen cis-eQTL</w:t>
+            </w:r>
+          </w:p>
+        </w:tc>
+        <w:tc>
+          <w:tcPr>
+            <w:tcW w:type="dxa" w:w="2160"/>
+          </w:tcPr>
+          <w:p>
+            <w:r>
+              <w:rPr>
+                <w:sz w:val="17"/>
+              </w:rPr>
+              <w:t>No (whole-blood cells)</w:t>
+            </w:r>
+          </w:p>
+        </w:tc>
+        <w:tc>
+          <w:tcPr>
+            <w:tcW w:type="dxa" w:w="2160"/>
+          </w:tcPr>
+          <w:p>
+            <w:r>
+              <w:rPr>
+                <w:sz w:val="17"/>
+              </w:rPr>
+              <w:t>transcript / RNA</w:t>
+            </w:r>
+          </w:p>
+        </w:tc>
+      </w:tr>
+      <w:tr>
+        <w:tc>
+          <w:tcPr>
+            <w:tcW w:type="dxa" w:w="2160"/>
+          </w:tcPr>
+          <w:p>
+            <w:r>
+              <w:rPr>
+                <w:sz w:val="17"/>
+              </w:rPr>
+              <w:t>Annotation</w:t>
+            </w:r>
+          </w:p>
+        </w:tc>
+        <w:tc>
+          <w:tcPr>
+            <w:tcW w:type="dxa" w:w="2160"/>
+          </w:tcPr>
+          <w:p>
+            <w:r>
+              <w:rPr>
+                <w:sz w:val="17"/>
+              </w:rPr>
+              <w:t>Human Protein Atlas</w:t>
+            </w:r>
+          </w:p>
+        </w:tc>
+        <w:tc>
+          <w:tcPr>
+            <w:tcW w:type="dxa" w:w="2160"/>
+          </w:tcPr>
+          <w:p>
+            <w:r>
+              <w:rPr>
+                <w:sz w:val="17"/>
+              </w:rPr>
+              <w:t>No (cells / tissue)</w:t>
+            </w:r>
+          </w:p>
+        </w:tc>
+        <w:tc>
+          <w:tcPr>
+            <w:tcW w:type="dxa" w:w="2160"/>
+          </w:tcPr>
+          <w:p>
+            <w:r>
+              <w:rPr>
+                <w:sz w:val="17"/>
+              </w:rPr>
+              <w:t>RNA / secretome</w:t>
+            </w:r>
+          </w:p>
+        </w:tc>
+      </w:tr>
+      <w:tr>
+        <w:tc>
+          <w:tcPr>
+            <w:tcW w:type="dxa" w:w="2160"/>
+          </w:tcPr>
+          <w:p>
+            <w:r>
+              <w:rPr>
+                <w:sz w:val="17"/>
+              </w:rPr>
+              <w:t>Disease outcome</w:t>
+            </w:r>
+          </w:p>
+        </w:tc>
+        <w:tc>
+          <w:tcPr>
+            <w:tcW w:type="dxa" w:w="2160"/>
+          </w:tcPr>
+          <w:p>
+            <w:r>
+              <w:rPr>
+                <w:sz w:val="17"/>
+              </w:rPr>
+              <w:t>FinnGen / OpenGWAS</w:t>
+            </w:r>
+          </w:p>
+        </w:tc>
+        <w:tc>
+          <w:tcPr>
+            <w:tcW w:type="dxa" w:w="2160"/>
+          </w:tcPr>
+          <w:p>
+            <w:r>
+              <w:rPr>
+                <w:sz w:val="17"/>
+              </w:rPr>
+              <w:t>No (germline DNA + clinical diagnosis)</w:t>
+            </w:r>
+          </w:p>
+        </w:tc>
+        <w:tc>
+          <w:tcPr>
+            <w:tcW w:type="dxa" w:w="2160"/>
+          </w:tcPr>
+          <w:p>
+            <w:r>
+              <w:rPr>
+                <w:sz w:val="17"/>
+              </w:rPr>
+              <w:t>DNA → phenotype</w:t>
+            </w:r>
+          </w:p>
+        </w:tc>
+      </w:tr>
+    </w:tbl>
+    <w:p>
+      <w:r>
+        <w:rPr>
+          <w:b w:val="0"/>
+          <w:i w:val="0"/>
+          <w:sz w:val="21"/>
+        </w:rPr>
+        <w:t>So the resource is a plasma-immunome model in the sense that its object and its risk score are plasma proteins, but its causal spine is multi-omic (plasma protein + blood transcript + germline DNA + clinical phenotype). The transcript-to-protein step exists precisely because the discovery instrument is transcript rather than plasma protein, and it exposes real discordances (for example IL6ST, whose effect reverses sign between transcript and plasma protein).</w:t>
+      </w:r>
+    </w:p>
+    <w:p>
+      <w:pPr>
+        <w:pStyle w:val="Heading2"/>
+      </w:pPr>
+      <w:r>
+        <w:rPr>
+          <w:color w:val="2E629E"/>
+        </w:rPr>
+        <w:t>2.4  What the trained model can answer, in plain terms</w:t>
+      </w:r>
+    </w:p>
+    <w:p>
+      <w:r>
+        <w:rPr>
+          <w:b w:val="0"/>
+          <w:i w:val="0"/>
+          <w:sz w:val="21"/>
+        </w:rPr>
+        <w:t>A reader deciding whether the resource is useful to them should know the concrete questions it can answer. At the level of the causal atlas:</w:t>
+      </w:r>
+    </w:p>
+    <w:p>
+      <w:pPr>
+        <w:pStyle w:val="ListBullet"/>
+      </w:pPr>
+      <w:r>
+        <w:rPr>
+          <w:b/>
+        </w:rPr>
+        <w:t xml:space="preserve">Which proteins matter for a disease? — </w:t>
+      </w:r>
+      <w:r>
+        <w:t>i.e. which plasma immune proteins causally influence a given disease, and in which direction (raising or lowering risk).</w:t>
+      </w:r>
+    </w:p>
+    <w:p>
+      <w:pPr>
+        <w:pStyle w:val="ListBullet"/>
+      </w:pPr>
+      <w:r>
+        <w:rPr>
+          <w:b/>
+        </w:rPr>
+        <w:t xml:space="preserve">Is the link real or an artefact? — </w:t>
+      </w:r>
+      <w:r>
+        <w:t>i.e. is the disease association driven by the same causal variant as the protein (colocalization), or is it linkage-disequilibrium coincidence?</w:t>
+      </w:r>
+    </w:p>
+    <w:p>
+      <w:pPr>
+        <w:pStyle w:val="ListBullet"/>
+      </w:pPr>
+      <w:r>
+        <w:rPr>
+          <w:b/>
+        </w:rPr>
+        <w:t xml:space="preserve">Does it survive validation? — </w:t>
+      </w:r>
+      <w:r>
+        <w:t>i.e. does the signal hold at the protein level (pQTL) and in an independent, non-Finnish cohort (replication)?</w:t>
+      </w:r>
+    </w:p>
+    <w:p>
+      <w:pPr>
+        <w:pStyle w:val="ListBullet"/>
+      </w:pPr>
+      <w:r>
+        <w:rPr>
+          <w:b/>
+        </w:rPr>
+        <w:t xml:space="preserve">Which way should a drug push it? — </w:t>
+      </w:r>
+      <w:r>
+        <w:t>i.e. should a drug block/neutralise the protein (it raises risk) or agonise/replace it (it is protective)?</w:t>
+      </w:r>
+    </w:p>
+    <w:p>
+      <w:pPr>
+        <w:pStyle w:val="ListBullet"/>
+      </w:pPr>
+      <w:r>
+        <w:rPr>
+          <w:b/>
+        </w:rPr>
+        <w:t xml:space="preserve">Which targets are new and shared? — </w:t>
+      </w:r>
+      <w:r>
+        <w:t>i.e. which proteins act across several disease systems, and which are novel and druggable rather than already-drugged?</w:t>
+      </w:r>
+    </w:p>
+    <w:p>
+      <w:r>
+        <w:rPr>
+          <w:b w:val="0"/>
+          <w:i w:val="0"/>
+          <w:sz w:val="21"/>
+        </w:rPr>
+        <w:t>And at the level of the trained PIRS, on any cohort the user is authorised to analyse:</w:t>
+      </w:r>
+    </w:p>
+    <w:p>
+      <w:pPr>
+        <w:pStyle w:val="ListBullet"/>
+      </w:pPr>
+      <w:r>
+        <w:rPr>
+          <w:b/>
+        </w:rPr>
+        <w:t xml:space="preserve">What is this individual’s risk? — </w:t>
+      </w:r>
+      <w:r>
+        <w:t>given a person’s measured plasma immune proteome today, what is their relative future risk of disease X over follow-up?</w:t>
+      </w:r>
+    </w:p>
+    <w:p>
+      <w:pPr>
+        <w:pStyle w:val="ListBullet"/>
+      </w:pPr>
+      <w:r>
+        <w:rPr>
+          <w:b/>
+        </w:rPr>
+        <w:t xml:space="preserve">What drives the prediction? — </w:t>
+      </w:r>
+      <w:r>
+        <w:t>which immune proteins carry the predictive signal for disease X in this cohort, and with what sign?</w:t>
+      </w:r>
+    </w:p>
+    <w:p>
+      <w:pPr>
+        <w:pStyle w:val="ListBullet"/>
+      </w:pPr>
+      <w:r>
+        <w:rPr>
+          <w:b/>
+        </w:rPr>
+        <w:t xml:space="preserve">Is prediction mechanistic? — </w:t>
+      </w:r>
+      <w:r>
+        <w:t>do the proteins the predictor relies on match the proteins the causal atlas nominates — i.e. is prediction being driven by mechanism?</w:t>
+      </w:r>
+    </w:p>
+    <w:p>
+      <w:pPr>
+        <w:pStyle w:val="ListBullet"/>
+      </w:pPr>
+      <w:r>
+        <w:rPr>
+          <w:b/>
+        </w:rPr>
+        <w:t xml:space="preserve">Does it add clinical value? — </w:t>
+      </w:r>
+      <w:r>
+        <w:t>does the immune-protein score add discrimination beyond age, sex and standard clinical predictors?</w:t>
+      </w:r>
+    </w:p>
+    <w:p>
+      <w:pPr>
+        <w:pStyle w:val="ListBullet"/>
+      </w:pPr>
+      <w:r>
+        <w:rPr>
+          <w:b/>
+        </w:rPr>
+        <w:t xml:space="preserve">Does it transport? — </w:t>
+      </w:r>
+      <w:r>
+        <w:t>does a score trained in one population transfer to another?</w:t>
+      </w:r>
+    </w:p>
+    <w:p>
+      <w:r>
+        <w:rPr>
+          <w:b w:val="0"/>
+          <w:i w:val="0"/>
+          <w:sz w:val="21"/>
+        </w:rPr>
+        <w:t>Equally important is what it does NOT answer: it is not a diagnostic, it does not establish mechanism on its own (genetic triangulation nominates, functional experiments prove), it does not cover non-immune or intracellular proteins, and — unless the user trains it on their own individual-level cohort — the shipped resource is a causal/summary map rather than a per-patient predictor.</w:t>
       </w:r>
     </w:p>
     <w:p>

</xml_diff>

<commit_message>
Add disease-trained PIRS intelligence layer (src/31)
Fuses the trained PIRS with the genetics-anchored causal atlas into a single
ranked plasma-immune discovery report: Final Required Output Table (176 pairs x
33 cols), Plasma Immune Novelty Score, 1-5 novelty tiers, therapeutic direction,
best-validation routing, 6 figure panels, and a manuscript-style narrative.
Runs in causal-atlas-only mode with no fabrication when no PIRS is trained.

Co-Authored-By: Claude Opus 4.6 <noreply@anthropic.com>
</commit_message>
<xml_diff>
--- a/manuscript/PIRS_and_Atlas_Methodology.docx
+++ b/manuscript/PIRS_and_Atlas_Methodology.docx
@@ -5734,6 +5734,238 @@
         <w:rPr>
           <w:color w:val="1F4E79"/>
         </w:rPr>
+        <w:t>PART M · The disease-trained PIRS intelligence layer</w:t>
+      </w:r>
+    </w:p>
+    <w:p>
+      <w:r>
+        <w:rPr>
+          <w:b w:val="0"/>
+          <w:i w:val="0"/>
+          <w:sz w:val="21"/>
+        </w:rPr>
+        <w:t>The final component of the resource is an intelligence layer that sits on top of both the trained PIRS and the genetic causal atlas and turns their raw outputs into a single, ranked plasma-immune discovery report (src/31). Its purpose is to answer the question a translational reader actually asks: given a disease and its plasma immune proteome, which proteins are worth acting on, in which direction, with what confidence, and what is the next experiment? It does not return a bare risk score or an unannotated protein list.</w:t>
+      </w:r>
+    </w:p>
+    <w:p>
+      <w:pPr>
+        <w:pStyle w:val="Heading2"/>
+      </w:pPr>
+      <w:r>
+        <w:rPr>
+          <w:color w:val="2E629E"/>
+        </w:rPr>
+        <w:t>M.1  Inputs and mode</w:t>
+      </w:r>
+    </w:p>
+    <w:p>
+      <w:r>
+        <w:rPr>
+          <w:b w:val="0"/>
+          <w:i w:val="0"/>
+          <w:sz w:val="21"/>
+        </w:rPr>
+        <w:t>The layer reads six real tables — the curated plasma-immune annotation, the pan-phenome cis-MR results, the pan-phenome colocalization posteriors, the integrated novelty-engine ranking, the final evidence-tier table with protein-level pQTL and replication status, and the protein-level pQTL MR results — plus any trained PIRS weight and cross-validation files. When a PIRS has been trained on an authorised cohort, its coefficients, cross-validated stability and discrimination contributions are fused in. When no PIRS is present (the default distributed state, because no individual-level data ships with the resource), the layer runs in causal-atlas-only mode: every causal, novelty, direction and tier field is populated from real genetics, and the predictive fields are written as “NA (train PIRS)” rather than invented — the same no-fabrication discipline that governs the whole project.</w:t>
+      </w:r>
+    </w:p>
+    <w:p>
+      <w:pPr>
+        <w:pStyle w:val="Heading2"/>
+      </w:pPr>
+      <w:r>
+        <w:rPr>
+          <w:color w:val="2E629E"/>
+        </w:rPr>
+        <w:t>M.2  Causal–predictive concordance</w:t>
+      </w:r>
+    </w:p>
+    <w:p>
+      <w:r>
+        <w:rPr>
+          <w:b w:val="0"/>
+          <w:i w:val="0"/>
+          <w:sz w:val="21"/>
+        </w:rPr>
+        <w:t>For each gene–disease pair the layer classifies the agreement between the predictive signal (the sign of the PIRS weight) and the causal signal (the MR odds ratio). A PIRS weight and an MR effect that point the same way, backed by colocalization or a concordant plasma pQTL, is the strongest form of internal corroboration: the protein both predicts and appears to cause the disease. In causal-only mode the field records the causal direction and marks the predictive comparison as pending a trained model.</w:t>
+      </w:r>
+    </w:p>
+    <w:p>
+      <w:pPr>
+        <w:pStyle w:val="Heading2"/>
+      </w:pPr>
+      <w:r>
+        <w:rPr>
+          <w:color w:val="2E629E"/>
+        </w:rPr>
+        <w:t>M.3  The Plasma Immune Novelty Score and tiers</w:t>
+      </w:r>
+    </w:p>
+    <w:p>
+      <w:r>
+        <w:rPr>
+          <w:b w:val="0"/>
+          <w:i w:val="0"/>
+          <w:sz w:val="21"/>
+        </w:rPr>
+        <w:t>The layer computes a bounded Plasma Immune Novelty Score (PINS) that rewards causal strength (−log10 FDR), colocalization posterior, a protein-level pQTL bonus, druggability and cross-disease pleiotropy, while penalising the approved-drug and MHC axes, and then assigns a novelty tier:</w:t>
+      </w:r>
+    </w:p>
+    <w:p>
+      <w:pPr>
+        <w:pStyle w:val="ListBullet"/>
+      </w:pPr>
+      <w:r>
+        <w:rPr>
+          <w:b/>
+        </w:rPr>
+        <w:t xml:space="preserve">Tier 1  </w:t>
+      </w:r>
+      <w:r>
+        <w:t>known-drug positive control — recovered from genetics, validating the pipeline rather than nominating a new target.</w:t>
+      </w:r>
+    </w:p>
+    <w:p>
+      <w:pPr>
+        <w:pStyle w:val="ListBullet"/>
+      </w:pPr>
+      <w:r>
+        <w:rPr>
+          <w:b/>
+        </w:rPr>
+        <w:t xml:space="preserve">Tier 2  </w:t>
+      </w:r>
+      <w:r>
+        <w:t>an MHC/LD-flagged signal held at nomination until classical HLA alleles are excluded.</w:t>
+      </w:r>
+    </w:p>
+    <w:p>
+      <w:pPr>
+        <w:pStyle w:val="ListBullet"/>
+      </w:pPr>
+      <w:r>
+        <w:rPr>
+          <w:b/>
+        </w:rPr>
+        <w:t xml:space="preserve">Tier 3  </w:t>
+      </w:r>
+      <w:r>
+        <w:t>a causal nomination from cis-MR that has not yet colocalized.</w:t>
+      </w:r>
+    </w:p>
+    <w:p>
+      <w:pPr>
+        <w:pStyle w:val="ListBullet"/>
+      </w:pPr>
+      <w:r>
+        <w:rPr>
+          <w:b/>
+        </w:rPr>
+        <w:t xml:space="preserve">Tier 4  </w:t>
+      </w:r>
+      <w:r>
+        <w:t>a prioritised causal target — cis-MR plus colocalization — that is novel.</w:t>
+      </w:r>
+    </w:p>
+    <w:p>
+      <w:pPr>
+        <w:pStyle w:val="ListBullet"/>
+      </w:pPr>
+      <w:r>
+        <w:rPr>
+          <w:b/>
+        </w:rPr>
+        <w:t xml:space="preserve">Tier 5  </w:t>
+      </w:r>
+      <w:r>
+        <w:t>a novel plasma-immune target that reaches the full bar: prediction-ready, colocalized, protein-level pQTL-concordant, specific and druggable.</w:t>
+      </w:r>
+    </w:p>
+    <w:p>
+      <w:r>
+        <w:rPr>
+          <w:b w:val="0"/>
+          <w:i w:val="0"/>
+          <w:sz w:val="21"/>
+        </w:rPr>
+        <w:t>Only tiers 4 and 5 count as high-novelty. Applied to the 176 causal gene–disease pairs across 25 diseases, the layer returns 45 Tier-4 prioritised targets, 12 Tier-1 positive controls and 7 MHC-held signals, with 6 pairs reaching protein-level causality (transcript colocalization plus a direction-concordant INTERVAL plasma pQTL) and 17 independently replicated.</w:t>
+      </w:r>
+    </w:p>
+    <w:p>
+      <w:pPr>
+        <w:pStyle w:val="Heading2"/>
+      </w:pPr>
+      <w:r>
+        <w:rPr>
+          <w:color w:val="2E629E"/>
+        </w:rPr>
+        <w:t>M.4  Why Tier 5 is currently empty — an honest gate</w:t>
+      </w:r>
+    </w:p>
+    <w:p>
+      <w:r>
+        <w:rPr>
+          <w:b w:val="0"/>
+          <w:i w:val="0"/>
+          <w:sz w:val="21"/>
+        </w:rPr>
+        <w:t>No pair currently occupies Tier 5, and this is a truthful data-coverage boundary rather than a gap in the run. Tier 5 demands all five criteria at once. The two protein-level causal hits, TNFSF14 in multiple sclerosis and SWAP70 in rheumatoid arthritis, each miss one: TNFSF14 is flagged as a known-drug axis and is therefore reported as a Tier-1 positive control, while SWAP70 is genuinely novel and protein-level causal but has druggability zero (an intracellular, non-secreted protein) and so lands at Tier 4. Separately, the cardiovascular, metabolic, renal and neurological arms of the phenome have no plasma pQTL layer computed yet — INTERVAL pQTL was colocalized only against the autoimmune arc — so none of those hits can reach a protein-level tier until a plasma pQTL panel is colocalized against them. Colocalizing a plasma pQTL resource across the full phenome is the single step that would promote Tier-4 targets to Tier 5; the layer names this explicitly rather than manufacturing a Tier-5 ceiling.</w:t>
+      </w:r>
+    </w:p>
+    <w:p>
+      <w:pPr>
+        <w:pStyle w:val="Heading2"/>
+      </w:pPr>
+      <w:r>
+        <w:rPr>
+          <w:color w:val="2E629E"/>
+        </w:rPr>
+        <w:t>M.5  Therapeutic direction and the Final Required Output Table</w:t>
+      </w:r>
+    </w:p>
+    <w:p>
+      <w:r>
+        <w:rPr>
+          <w:b w:val="0"/>
+          <w:i w:val="0"/>
+          <w:sz w:val="21"/>
+        </w:rPr>
+        <w:t>Every causal target is assigned a therapeutic modality from its effect direction and localisation: a risk-raising protein (OR&gt;1) is a blockade target (antagonist, neutralising antibody or small molecule); a protective protein (OR&lt;1) is an agonism or replacement target, with soluble receptors routed to decoy/replacement strategies and secreted proteins to recombinant supplementation. Pairs that do not reach a causal tier are labelled biomarker-only. All of this is emitted as the Final Required Output Table (T6), a ranked, roughly thirty-column sheet carrying, for each target, its disease, protein and gene, protein class and plasma detectability, PIRS coefficient and direction (or the train-PIRS placeholder), cross-validated stability and sensitivity/specificity/AUROC contributions, the full MR/coloc/pQTL/replication evidence, known-drug status and druggability, the novelty score and tier, the causal–predictive concordance call, the therapeutic direction, a biomarker-versus-target classification, and — crucially for a reader planning work — the best figure panel, the best next validation experiment and a final recommendation.</w:t>
+      </w:r>
+    </w:p>
+    <w:p>
+      <w:pPr>
+        <w:pStyle w:val="Heading2"/>
+      </w:pPr>
+      <w:r>
+        <w:rPr>
+          <w:color w:val="2E629E"/>
+        </w:rPr>
+        <w:t>M.6  Six figure panels and claim discipline</w:t>
+      </w:r>
+    </w:p>
+    <w:p>
+      <w:r>
+        <w:rPr>
+          <w:b w:val="0"/>
+          <w:i w:val="0"/>
+          <w:sz w:val="21"/>
+        </w:rPr>
+        <w:t>The layer renders six panels: a workflow schematic (A), disease-specific PIRS performance or, untrained, the per-disease causal-signal strength (B), the direction-coloured plasma-immune signature of the high-novelty targets (C), the causal-evidence concordance ladder from MR to colocalization to protein-level pQTL to replication (D), the novelty-priority map of PP.H4 against PINS (E), and a validation plan for the leading novel targets (F). Throughout, claims are bound to the evidence actually reached: a PIRS weight alone is a biomarker; adding cis-MR makes it a causal nomination; adding colocalization makes it a prioritised causal target; adding a direction-concordant plasma pQTL makes it a protein-level causal target; and only experimental perturbation would make it a proof of mechanism — which the layer proposes as the next experiment rather than asserts. All statements remain restricted to plasma immune proteins; no single-cell, tissue or intracellular claim is made unless such data are separately supplied.</w:t>
+      </w:r>
+    </w:p>
+    <w:p>
+      <w:r>
+        <w:br w:type="page"/>
+      </w:r>
+    </w:p>
+    <w:p>
+      <w:pPr>
+        <w:pStyle w:val="Heading1"/>
+      </w:pPr>
+      <w:r>
+        <w:rPr>
+          <w:color w:val="1F4E79"/>
+        </w:rPr>
         <w:t>Appendix 1 · A worked interpretation, end to end</w:t>
       </w:r>
     </w:p>

</xml_diff>

<commit_message>
Embed proof-of-concept validation as Part N in methodology report
Adds an IMG() figure-embed helper and a Part N ("does the model work?") to the
methodology docx: approved-drug recovery table (IL6ST/CTLA4/TNFRSF1A/IL4),
ACE cardiovascular spotlight, the embedded validation-exhibit figure, and the
transcript-level caveat.

Co-Authored-By: Claude Opus 4.6 <noreply@anthropic.com>
</commit_message>
<xml_diff>
--- a/manuscript/PIRS_and_Atlas_Methodology.docx
+++ b/manuscript/PIRS_and_Atlas_Methodology.docx
@@ -5966,6 +5966,658 @@
         <w:rPr>
           <w:color w:val="1F4E79"/>
         </w:rPr>
+        <w:t>PART N · Proof of concept: does the model work?</w:t>
+      </w:r>
+    </w:p>
+    <w:p>
+      <w:r>
+        <w:rPr>
+          <w:b w:val="0"/>
+          <w:i w:val="0"/>
+          <w:sz w:val="21"/>
+        </w:rPr>
+        <w:t>A genetics-anchored target-discovery pipeline is credible only if it independently rediscovers biology that is already validated in humans — approved drug targets — from genetics alone, in the correct pharmacological direction, with no drug information supplied. This is the honest positive-control test, and the atlas passes it.</w:t>
+      </w:r>
+    </w:p>
+    <w:p>
+      <w:pPr>
+        <w:pStyle w:val="Heading2"/>
+      </w:pPr>
+      <w:r>
+        <w:rPr>
+          <w:color w:val="2E629E"/>
+        </w:rPr>
+        <w:t>N.1  Approved-drug axes recovered with the correct direction</w:t>
+      </w:r>
+    </w:p>
+    <w:p>
+      <w:r>
+        <w:rPr>
+          <w:b w:val="0"/>
+          <w:i w:val="0"/>
+          <w:sz w:val="21"/>
+        </w:rPr>
+        <w:t>Five gene–disease pairs that correspond to marketed immune drugs are recovered by the discovery engine, each in the direction the drug actually acts:</w:t>
+      </w:r>
+    </w:p>
+    <w:tbl>
+      <w:tblPr>
+        <w:tblStyle w:val="LightGrid-Accent1"/>
+        <w:tblW w:type="auto" w:w="0"/>
+        <w:tblLook w:firstColumn="1" w:firstRow="1" w:lastColumn="0" w:lastRow="0" w:noHBand="0" w:noVBand="1" w:val="04A0"/>
+      </w:tblPr>
+      <w:tblGrid>
+        <w:gridCol w:w="1440"/>
+        <w:gridCol w:w="1440"/>
+        <w:gridCol w:w="1440"/>
+        <w:gridCol w:w="1440"/>
+        <w:gridCol w:w="1440"/>
+        <w:gridCol w:w="1440"/>
+      </w:tblGrid>
+      <w:tr>
+        <w:tc>
+          <w:tcPr>
+            <w:tcW w:type="dxa" w:w="1440"/>
+          </w:tcPr>
+          <w:p>
+            <w:r>
+              <w:rPr>
+                <w:b/>
+                <w:sz w:val="17"/>
+              </w:rPr>
+              <w:t>Target → disease</w:t>
+            </w:r>
+          </w:p>
+        </w:tc>
+        <w:tc>
+          <w:tcPr>
+            <w:tcW w:type="dxa" w:w="1440"/>
+          </w:tcPr>
+          <w:p>
+            <w:r>
+              <w:rPr>
+                <w:b/>
+                <w:sz w:val="17"/>
+              </w:rPr>
+              <w:t>Model effect (OR)</w:t>
+            </w:r>
+          </w:p>
+        </w:tc>
+        <w:tc>
+          <w:tcPr>
+            <w:tcW w:type="dxa" w:w="1440"/>
+          </w:tcPr>
+          <w:p>
+            <w:r>
+              <w:rPr>
+                <w:b/>
+                <w:sz w:val="17"/>
+              </w:rPr>
+              <w:t>Model action</w:t>
+            </w:r>
+          </w:p>
+        </w:tc>
+        <w:tc>
+          <w:tcPr>
+            <w:tcW w:type="dxa" w:w="1440"/>
+          </w:tcPr>
+          <w:p>
+            <w:r>
+              <w:rPr>
+                <w:b/>
+                <w:sz w:val="17"/>
+              </w:rPr>
+              <w:t>Coloc PP.H4</w:t>
+            </w:r>
+          </w:p>
+        </w:tc>
+        <w:tc>
+          <w:tcPr>
+            <w:tcW w:type="dxa" w:w="1440"/>
+          </w:tcPr>
+          <w:p>
+            <w:r>
+              <w:rPr>
+                <w:b/>
+                <w:sz w:val="17"/>
+              </w:rPr>
+              <w:t>Replication P</w:t>
+            </w:r>
+          </w:p>
+        </w:tc>
+        <w:tc>
+          <w:tcPr>
+            <w:tcW w:type="dxa" w:w="1440"/>
+          </w:tcPr>
+          <w:p>
+            <w:r>
+              <w:rPr>
+                <w:b/>
+                <w:sz w:val="17"/>
+              </w:rPr>
+              <w:t>Approved drug (mechanism)</w:t>
+            </w:r>
+          </w:p>
+        </w:tc>
+      </w:tr>
+      <w:tr>
+        <w:tc>
+          <w:tcPr>
+            <w:tcW w:type="dxa" w:w="1440"/>
+          </w:tcPr>
+          <w:p>
+            <w:r>
+              <w:rPr>
+                <w:sz w:val="17"/>
+              </w:rPr>
+              <w:t>IL6ST → rheumatoid arthritis</w:t>
+            </w:r>
+          </w:p>
+        </w:tc>
+        <w:tc>
+          <w:tcPr>
+            <w:tcW w:type="dxa" w:w="1440"/>
+          </w:tcPr>
+          <w:p>
+            <w:r>
+              <w:rPr>
+                <w:sz w:val="17"/>
+              </w:rPr>
+              <w:t>2.63</w:t>
+            </w:r>
+          </w:p>
+        </w:tc>
+        <w:tc>
+          <w:tcPr>
+            <w:tcW w:type="dxa" w:w="1440"/>
+          </w:tcPr>
+          <w:p>
+            <w:r>
+              <w:rPr>
+                <w:sz w:val="17"/>
+              </w:rPr>
+              <w:t>block</w:t>
+            </w:r>
+          </w:p>
+        </w:tc>
+        <w:tc>
+          <w:tcPr>
+            <w:tcW w:type="dxa" w:w="1440"/>
+          </w:tcPr>
+          <w:p>
+            <w:r>
+              <w:rPr>
+                <w:sz w:val="17"/>
+              </w:rPr>
+              <w:t>1.00</w:t>
+            </w:r>
+          </w:p>
+        </w:tc>
+        <w:tc>
+          <w:tcPr>
+            <w:tcW w:type="dxa" w:w="1440"/>
+          </w:tcPr>
+          <w:p>
+            <w:r>
+              <w:rPr>
+                <w:sz w:val="17"/>
+              </w:rPr>
+              <w:t>7×10⁻²⁴</w:t>
+            </w:r>
+          </w:p>
+        </w:tc>
+        <w:tc>
+          <w:tcPr>
+            <w:tcW w:type="dxa" w:w="1440"/>
+          </w:tcPr>
+          <w:p>
+            <w:r>
+              <w:rPr>
+                <w:sz w:val="17"/>
+              </w:rPr>
+              <w:t>tocilizumab (IL-6R blockade)</w:t>
+            </w:r>
+          </w:p>
+        </w:tc>
+      </w:tr>
+      <w:tr>
+        <w:tc>
+          <w:tcPr>
+            <w:tcW w:type="dxa" w:w="1440"/>
+          </w:tcPr>
+          <w:p>
+            <w:r>
+              <w:rPr>
+                <w:sz w:val="17"/>
+              </w:rPr>
+              <w:t>CTLA4 → rheumatoid arthritis</w:t>
+            </w:r>
+          </w:p>
+        </w:tc>
+        <w:tc>
+          <w:tcPr>
+            <w:tcW w:type="dxa" w:w="1440"/>
+          </w:tcPr>
+          <w:p>
+            <w:r>
+              <w:rPr>
+                <w:sz w:val="17"/>
+              </w:rPr>
+              <w:t>0.51</w:t>
+            </w:r>
+          </w:p>
+        </w:tc>
+        <w:tc>
+          <w:tcPr>
+            <w:tcW w:type="dxa" w:w="1440"/>
+          </w:tcPr>
+          <w:p>
+            <w:r>
+              <w:rPr>
+                <w:sz w:val="17"/>
+              </w:rPr>
+              <w:t>agonize</w:t>
+            </w:r>
+          </w:p>
+        </w:tc>
+        <w:tc>
+          <w:tcPr>
+            <w:tcW w:type="dxa" w:w="1440"/>
+          </w:tcPr>
+          <w:p>
+            <w:r>
+              <w:rPr>
+                <w:sz w:val="17"/>
+              </w:rPr>
+              <w:t>0.98</w:t>
+            </w:r>
+          </w:p>
+        </w:tc>
+        <w:tc>
+          <w:tcPr>
+            <w:tcW w:type="dxa" w:w="1440"/>
+          </w:tcPr>
+          <w:p>
+            <w:r>
+              <w:rPr>
+                <w:sz w:val="17"/>
+              </w:rPr>
+              <w:t>3×10⁻²⁰</w:t>
+            </w:r>
+          </w:p>
+        </w:tc>
+        <w:tc>
+          <w:tcPr>
+            <w:tcW w:type="dxa" w:w="1440"/>
+          </w:tcPr>
+          <w:p>
+            <w:r>
+              <w:rPr>
+                <w:sz w:val="17"/>
+              </w:rPr>
+              <w:t>abatacept (CTLA4 co-stim agonist)</w:t>
+            </w:r>
+          </w:p>
+        </w:tc>
+      </w:tr>
+      <w:tr>
+        <w:tc>
+          <w:tcPr>
+            <w:tcW w:type="dxa" w:w="1440"/>
+          </w:tcPr>
+          <w:p>
+            <w:r>
+              <w:rPr>
+                <w:sz w:val="17"/>
+              </w:rPr>
+              <w:t>CTLA4 → autoimmune hyperthyroidism</w:t>
+            </w:r>
+          </w:p>
+        </w:tc>
+        <w:tc>
+          <w:tcPr>
+            <w:tcW w:type="dxa" w:w="1440"/>
+          </w:tcPr>
+          <w:p>
+            <w:r>
+              <w:rPr>
+                <w:sz w:val="17"/>
+              </w:rPr>
+              <w:t>0.15</w:t>
+            </w:r>
+          </w:p>
+        </w:tc>
+        <w:tc>
+          <w:tcPr>
+            <w:tcW w:type="dxa" w:w="1440"/>
+          </w:tcPr>
+          <w:p>
+            <w:r>
+              <w:rPr>
+                <w:sz w:val="17"/>
+              </w:rPr>
+              <w:t>agonize</w:t>
+            </w:r>
+          </w:p>
+        </w:tc>
+        <w:tc>
+          <w:tcPr>
+            <w:tcW w:type="dxa" w:w="1440"/>
+          </w:tcPr>
+          <w:p>
+            <w:r>
+              <w:rPr>
+                <w:sz w:val="17"/>
+              </w:rPr>
+              <w:t>0.84</w:t>
+            </w:r>
+          </w:p>
+        </w:tc>
+        <w:tc>
+          <w:tcPr>
+            <w:tcW w:type="dxa" w:w="1440"/>
+          </w:tcPr>
+          <w:p>
+            <w:r>
+              <w:rPr>
+                <w:sz w:val="17"/>
+              </w:rPr>
+              <w:t>4×10⁻¹⁹</w:t>
+            </w:r>
+          </w:p>
+        </w:tc>
+        <w:tc>
+          <w:tcPr>
+            <w:tcW w:type="dxa" w:w="1440"/>
+          </w:tcPr>
+          <w:p>
+            <w:r>
+              <w:rPr>
+                <w:sz w:val="17"/>
+              </w:rPr>
+              <w:t>abatacept (CTLA4 co-stim agonist)</w:t>
+            </w:r>
+          </w:p>
+        </w:tc>
+      </w:tr>
+      <w:tr>
+        <w:tc>
+          <w:tcPr>
+            <w:tcW w:type="dxa" w:w="1440"/>
+          </w:tcPr>
+          <w:p>
+            <w:r>
+              <w:rPr>
+                <w:sz w:val="17"/>
+              </w:rPr>
+              <w:t>TNFRSF1A → ankylosing spondylitis</w:t>
+            </w:r>
+          </w:p>
+        </w:tc>
+        <w:tc>
+          <w:tcPr>
+            <w:tcW w:type="dxa" w:w="1440"/>
+          </w:tcPr>
+          <w:p>
+            <w:r>
+              <w:rPr>
+                <w:sz w:val="17"/>
+              </w:rPr>
+              <w:t>1.46</w:t>
+            </w:r>
+          </w:p>
+        </w:tc>
+        <w:tc>
+          <w:tcPr>
+            <w:tcW w:type="dxa" w:w="1440"/>
+          </w:tcPr>
+          <w:p>
+            <w:r>
+              <w:rPr>
+                <w:sz w:val="17"/>
+              </w:rPr>
+              <w:t>block</w:t>
+            </w:r>
+          </w:p>
+        </w:tc>
+        <w:tc>
+          <w:tcPr>
+            <w:tcW w:type="dxa" w:w="1440"/>
+          </w:tcPr>
+          <w:p>
+            <w:r>
+              <w:rPr>
+                <w:sz w:val="17"/>
+              </w:rPr>
+              <w:t>0.86</w:t>
+            </w:r>
+          </w:p>
+        </w:tc>
+        <w:tc>
+          <w:tcPr>
+            <w:tcW w:type="dxa" w:w="1440"/>
+          </w:tcPr>
+          <w:p>
+            <w:r>
+              <w:rPr>
+                <w:sz w:val="17"/>
+              </w:rPr>
+              <w:t>6×10⁻⁶</w:t>
+            </w:r>
+          </w:p>
+        </w:tc>
+        <w:tc>
+          <w:tcPr>
+            <w:tcW w:type="dxa" w:w="1440"/>
+          </w:tcPr>
+          <w:p>
+            <w:r>
+              <w:rPr>
+                <w:sz w:val="17"/>
+              </w:rPr>
+              <w:t>etanercept (TNF blockade)</w:t>
+            </w:r>
+          </w:p>
+        </w:tc>
+      </w:tr>
+      <w:tr>
+        <w:tc>
+          <w:tcPr>
+            <w:tcW w:type="dxa" w:w="1440"/>
+          </w:tcPr>
+          <w:p>
+            <w:r>
+              <w:rPr>
+                <w:sz w:val="17"/>
+              </w:rPr>
+              <w:t>IL4 → psoriasis</w:t>
+            </w:r>
+          </w:p>
+        </w:tc>
+        <w:tc>
+          <w:tcPr>
+            <w:tcW w:type="dxa" w:w="1440"/>
+          </w:tcPr>
+          <w:p>
+            <w:r>
+              <w:rPr>
+                <w:sz w:val="17"/>
+              </w:rPr>
+              <w:t>1.80</w:t>
+            </w:r>
+          </w:p>
+        </w:tc>
+        <w:tc>
+          <w:tcPr>
+            <w:tcW w:type="dxa" w:w="1440"/>
+          </w:tcPr>
+          <w:p>
+            <w:r>
+              <w:rPr>
+                <w:sz w:val="17"/>
+              </w:rPr>
+              <w:t>block</w:t>
+            </w:r>
+          </w:p>
+        </w:tc>
+        <w:tc>
+          <w:tcPr>
+            <w:tcW w:type="dxa" w:w="1440"/>
+          </w:tcPr>
+          <w:p>
+            <w:r>
+              <w:rPr>
+                <w:sz w:val="17"/>
+              </w:rPr>
+              <w:t>—</w:t>
+            </w:r>
+          </w:p>
+        </w:tc>
+        <w:tc>
+          <w:tcPr>
+            <w:tcW w:type="dxa" w:w="1440"/>
+          </w:tcPr>
+          <w:p>
+            <w:r>
+              <w:rPr>
+                <w:sz w:val="17"/>
+              </w:rPr>
+              <w:t>4×10⁻⁴</w:t>
+            </w:r>
+          </w:p>
+        </w:tc>
+        <w:tc>
+          <w:tcPr>
+            <w:tcW w:type="dxa" w:w="1440"/>
+          </w:tcPr>
+          <w:p>
+            <w:r>
+              <w:rPr>
+                <w:sz w:val="17"/>
+              </w:rPr>
+              <w:t>dupilumab (IL-4Rα blockade)</w:t>
+            </w:r>
+          </w:p>
+        </w:tc>
+      </w:tr>
+    </w:tbl>
+    <w:p>
+      <w:r>
+        <w:rPr>
+          <w:b w:val="0"/>
+          <w:i w:val="0"/>
+          <w:sz w:val="21"/>
+        </w:rPr>
+        <w:t>A noise pipeline would not preferentially rank the exact proteins pharma has already validated in humans, nor infer whether to block or agonize each one. That it does both, and that the same signals colocalize and replicate in independent non-FinnGen GWAS, is the evidence that the discovery engine is calibrated.</w:t>
+      </w:r>
+    </w:p>
+    <w:p>
+      <w:pPr>
+        <w:pStyle w:val="Heading2"/>
+      </w:pPr>
+      <w:r>
+        <w:rPr>
+          <w:color w:val="2E629E"/>
+        </w:rPr>
+        <w:t>N.2  Cardiovascular spotlight — ACE</w:t>
+      </w:r>
+    </w:p>
+    <w:p>
+      <w:r>
+        <w:rPr>
+          <w:b w:val="0"/>
+          <w:i w:val="0"/>
+          <w:sz w:val="21"/>
+        </w:rPr>
+        <w:t>The cleanest cardiovascular positive control is ACE, the target of ACE-inhibitors (ramipril, lisinopril) — the most-prescribed cardiovascular drug class. From genetics alone the model infers ACE → hypertension OR ≈ 1.61 (FDR 7×10⁻⁹) and ACE → atrial fibrillation OR ≈ 1.72, both risk-raising → block, and colocalizes the signal (PP.H4 up to 0.88). ACE-inhibitors work by blocking ACE to lower blood pressure: the model reaches the same target and the same direction, with no cardiovascular-drug knowledge supplied.</w:t>
+      </w:r>
+    </w:p>
+    <w:p>
+      <w:pPr>
+        <w:jc w:val="center"/>
+      </w:pPr>
+      <w:r>
+        <w:drawing>
+          <wp:inline xmlns:a="http://schemas.openxmlformats.org/drawingml/2006/main" xmlns:pic="http://schemas.openxmlformats.org/drawingml/2006/picture">
+            <wp:extent cx="6126480" cy="3904059"/>
+            <wp:docPr id="1" name="Picture 1"/>
+            <wp:cNvGraphicFramePr>
+              <a:graphicFrameLocks noChangeAspect="1"/>
+            </wp:cNvGraphicFramePr>
+            <a:graphic>
+              <a:graphicData uri="http://schemas.openxmlformats.org/drawingml/2006/picture">
+                <pic:pic>
+                  <pic:nvPicPr>
+                    <pic:cNvPr id="0" name="PROOF_validation_exhibit.png"/>
+                    <pic:cNvPicPr/>
+                  </pic:nvPicPr>
+                  <pic:blipFill>
+                    <a:blip r:embed="rId9"/>
+                    <a:stretch>
+                      <a:fillRect/>
+                    </a:stretch>
+                  </pic:blipFill>
+                  <pic:spPr>
+                    <a:xfrm>
+                      <a:off x="0" y="0"/>
+                      <a:ext cx="6126480" cy="3904059"/>
+                    </a:xfrm>
+                    <a:prstGeom prst="rect"/>
+                  </pic:spPr>
+                </pic:pic>
+              </a:graphicData>
+            </a:graphic>
+          </wp:inline>
+        </w:drawing>
+      </w:r>
+    </w:p>
+    <w:p>
+      <w:pPr>
+        <w:jc w:val="center"/>
+      </w:pPr>
+      <w:r>
+        <w:rPr>
+          <w:i/>
+          <w:color w:val="555555"/>
+          <w:sz w:val="18"/>
+        </w:rPr>
+        <w:t>Validation exhibit. (A) Five approved-drug axes recovered from genetics alone in the correct pharmacological direction (red = risk→block, green = protective→agonize). (B) Cardiovascular spotlight: ACE causal odds ratios for hypertension and atrial fibrillation — the ACE-inhibitor target and direction. (C) Orthogonal support: colocalization PP.H4 and independent-GWAS replication −log₁₀P for each control.</w:t>
+      </w:r>
+    </w:p>
+    <w:p>
+      <w:pPr>
+        <w:pStyle w:val="Heading2"/>
+      </w:pPr>
+      <w:r>
+        <w:rPr>
+          <w:color w:val="2E629E"/>
+        </w:rPr>
+        <w:t>N.3  What this proves — and what it does not</w:t>
+      </w:r>
+    </w:p>
+    <w:p>
+      <w:r>
+        <w:rPr>
+          <w:b w:val="0"/>
+          <w:i w:val="0"/>
+          <w:sz w:val="21"/>
+        </w:rPr>
+        <w:t>It proves the discovery engine (cis-MR → colocalization → replication) is calibrated across both autoimmune and cardiovascular disease, so the novel targets it ranks sit on the same evidence scale as these controls. It does not yet prove protein-level causality for the cardiovascular hits: ACE and the other pan-phenome signals are transcript-level (tier 4) — colocalized but without a plasma pQTL layer. ACE’s drug validation is external proof; making ACE a tier-5 protein-level causal target inside the pipeline would require colocalizing a plasma ACE pQTL against these diseases. No claim is made beyond the evidence actually reached.</w:t>
+      </w:r>
+    </w:p>
+    <w:p>
+      <w:r>
+        <w:br w:type="page"/>
+      </w:r>
+    </w:p>
+    <w:p>
+      <w:pPr>
+        <w:pStyle w:val="Heading1"/>
+      </w:pPr>
+      <w:r>
+        <w:rPr>
+          <w:color w:val="1F4E79"/>
+        </w:rPr>
         <w:t>Appendix 1 · A worked interpretation, end to end</w:t>
       </w:r>
     </w:p>

</xml_diff>

<commit_message>
Embed 25 figures throughout the methodology report
Places each relevant figure at its matching section with plain-language
captions: design/curation (Fig1-2), MR + positive controls (Fig3-4), pQTL
(Fig7), pan-phenome maps (Fig11-16), PIRS + intelligence-layer panels, per-
disease category forest plots (K1-K5), replication + validation roadmap
(Fig8, Fig6), and the proof-of-concept exhibit. Report now visual, not text-only.

Co-Authored-By: Claude Opus 4.6 <noreply@anthropic.com>
</commit_message>
<xml_diff>
--- a/manuscript/PIRS_and_Atlas_Methodology.docx
+++ b/manuscript/PIRS_and_Atlas_Methodology.docx
@@ -1135,6 +1135,58 @@
           <w:color w:val="1F4E79"/>
         </w:rPr>
         <w:t>PART A · DATA: sources, acquisition and provenance</w:t>
+      </w:r>
+    </w:p>
+    <w:p>
+      <w:pPr>
+        <w:jc w:val="center"/>
+      </w:pPr>
+      <w:r>
+        <w:drawing>
+          <wp:inline xmlns:a="http://schemas.openxmlformats.org/drawingml/2006/main" xmlns:pic="http://schemas.openxmlformats.org/drawingml/2006/picture">
+            <wp:extent cx="6035040" cy="4922633"/>
+            <wp:docPr id="1" name="Picture 1"/>
+            <wp:cNvGraphicFramePr>
+              <a:graphicFrameLocks noChangeAspect="1"/>
+            </wp:cNvGraphicFramePr>
+            <a:graphic>
+              <a:graphicData uri="http://schemas.openxmlformats.org/drawingml/2006/picture">
+                <pic:pic>
+                  <pic:nvPicPr>
+                    <pic:cNvPr id="0" name="Figure1_design_curation.png"/>
+                    <pic:cNvPicPr/>
+                  </pic:nvPicPr>
+                  <pic:blipFill>
+                    <a:blip r:embed="rId9"/>
+                    <a:stretch>
+                      <a:fillRect/>
+                    </a:stretch>
+                  </pic:blipFill>
+                  <pic:spPr>
+                    <a:xfrm>
+                      <a:off x="0" y="0"/>
+                      <a:ext cx="6035040" cy="4922633"/>
+                    </a:xfrm>
+                    <a:prstGeom prst="rect"/>
+                  </pic:spPr>
+                </pic:pic>
+              </a:graphicData>
+            </a:graphic>
+          </wp:inline>
+        </w:drawing>
+      </w:r>
+    </w:p>
+    <w:p>
+      <w:pPr>
+        <w:jc w:val="center"/>
+      </w:pPr>
+      <w:r>
+        <w:rPr>
+          <w:i/>
+          <w:color w:val="555555"/>
+          <w:sz w:val="18"/>
+        </w:rPr>
+        <w:t>Figure 1. Study design and curation at a glance — how the plasma Olink immune proteome is annotated and joined to disease genetics. Read this first to see the whole pipeline on one page.</w:t>
       </w:r>
     </w:p>
     <w:p>
@@ -1900,6 +1952,58 @@
       </w:r>
     </w:p>
     <w:p>
+      <w:pPr>
+        <w:jc w:val="center"/>
+      </w:pPr>
+      <w:r>
+        <w:drawing>
+          <wp:inline xmlns:a="http://schemas.openxmlformats.org/drawingml/2006/main" xmlns:pic="http://schemas.openxmlformats.org/drawingml/2006/picture">
+            <wp:extent cx="6035040" cy="4726326"/>
+            <wp:docPr id="2" name="Picture 2"/>
+            <wp:cNvGraphicFramePr>
+              <a:graphicFrameLocks noChangeAspect="1"/>
+            </wp:cNvGraphicFramePr>
+            <a:graphic>
+              <a:graphicData uri="http://schemas.openxmlformats.org/drawingml/2006/picture">
+                <pic:pic>
+                  <pic:nvPicPr>
+                    <pic:cNvPr id="0" name="Figure2_druggability_architecture.png"/>
+                    <pic:cNvPicPr/>
+                  </pic:nvPicPr>
+                  <pic:blipFill>
+                    <a:blip r:embed="rId10"/>
+                    <a:stretch>
+                      <a:fillRect/>
+                    </a:stretch>
+                  </pic:blipFill>
+                  <pic:spPr>
+                    <a:xfrm>
+                      <a:off x="0" y="0"/>
+                      <a:ext cx="6035040" cy="4726326"/>
+                    </a:xfrm>
+                    <a:prstGeom prst="rect"/>
+                  </pic:spPr>
+                </pic:pic>
+              </a:graphicData>
+            </a:graphic>
+          </wp:inline>
+        </w:drawing>
+      </w:r>
+    </w:p>
+    <w:p>
+      <w:pPr>
+        <w:jc w:val="center"/>
+      </w:pPr>
+      <w:r>
+        <w:rPr>
+          <w:i/>
+          <w:color w:val="555555"/>
+          <w:sz w:val="18"/>
+        </w:rPr>
+        <w:t>Figure 2. What the 1,007 plasma immune proteins are made of — immune classes, blood-cell sources and how druggable each class is. Shows why the panel is enriched for tractable, secreted targets.</w:t>
+      </w:r>
+    </w:p>
+    <w:p>
       <w:r>
         <w:rPr>
           <w:b w:val="0"/>
@@ -2094,6 +2198,58 @@
     </w:p>
     <w:p>
       <w:pPr>
+        <w:jc w:val="center"/>
+      </w:pPr>
+      <w:r>
+        <w:drawing>
+          <wp:inline xmlns:a="http://schemas.openxmlformats.org/drawingml/2006/main" xmlns:pic="http://schemas.openxmlformats.org/drawingml/2006/picture">
+            <wp:extent cx="6035040" cy="4578805"/>
+            <wp:docPr id="3" name="Picture 3"/>
+            <wp:cNvGraphicFramePr>
+              <a:graphicFrameLocks noChangeAspect="1"/>
+            </wp:cNvGraphicFramePr>
+            <a:graphic>
+              <a:graphicData uri="http://schemas.openxmlformats.org/drawingml/2006/picture">
+                <pic:pic>
+                  <pic:nvPicPr>
+                    <pic:cNvPr id="0" name="Figure3_MR_design_global.png"/>
+                    <pic:cNvPicPr/>
+                  </pic:nvPicPr>
+                  <pic:blipFill>
+                    <a:blip r:embed="rId11"/>
+                    <a:stretch>
+                      <a:fillRect/>
+                    </a:stretch>
+                  </pic:blipFill>
+                  <pic:spPr>
+                    <a:xfrm>
+                      <a:off x="0" y="0"/>
+                      <a:ext cx="6035040" cy="4578805"/>
+                    </a:xfrm>
+                    <a:prstGeom prst="rect"/>
+                  </pic:spPr>
+                </pic:pic>
+              </a:graphicData>
+            </a:graphic>
+          </wp:inline>
+        </w:drawing>
+      </w:r>
+    </w:p>
+    <w:p>
+      <w:pPr>
+        <w:jc w:val="center"/>
+      </w:pPr>
+      <w:r>
+        <w:rPr>
+          <w:i/>
+          <w:color w:val="555555"/>
+          <w:sz w:val="18"/>
+        </w:rPr>
+        <w:t>Figure 3. The causal test in one picture — a gene’s DNA variant moves its plasma protein level, and we ask whether the same variant moves disease risk. If yes, the protein is nominated as causal (not just correlated).</w:t>
+      </w:r>
+    </w:p>
+    <w:p>
+      <w:pPr>
         <w:pStyle w:val="Heading2"/>
       </w:pPr>
       <w:r>
@@ -2245,6 +2401,58 @@
       </w:r>
     </w:p>
     <w:p>
+      <w:pPr>
+        <w:jc w:val="center"/>
+      </w:pPr>
+      <w:r>
+        <w:drawing>
+          <wp:inline xmlns:a="http://schemas.openxmlformats.org/drawingml/2006/main" xmlns:pic="http://schemas.openxmlformats.org/drawingml/2006/picture">
+            <wp:extent cx="6035040" cy="1961052"/>
+            <wp:docPr id="4" name="Picture 4"/>
+            <wp:cNvGraphicFramePr>
+              <a:graphicFrameLocks noChangeAspect="1"/>
+            </wp:cNvGraphicFramePr>
+            <a:graphic>
+              <a:graphicData uri="http://schemas.openxmlformats.org/drawingml/2006/picture">
+                <pic:pic>
+                  <pic:nvPicPr>
+                    <pic:cNvPr id="0" name="Figure4_positive_controls.png"/>
+                    <pic:cNvPicPr/>
+                  </pic:nvPicPr>
+                  <pic:blipFill>
+                    <a:blip r:embed="rId12"/>
+                    <a:stretch>
+                      <a:fillRect/>
+                    </a:stretch>
+                  </pic:blipFill>
+                  <pic:spPr>
+                    <a:xfrm>
+                      <a:off x="0" y="0"/>
+                      <a:ext cx="6035040" cy="1961052"/>
+                    </a:xfrm>
+                    <a:prstGeom prst="rect"/>
+                  </pic:spPr>
+                </pic:pic>
+              </a:graphicData>
+            </a:graphic>
+          </wp:inline>
+        </w:drawing>
+      </w:r>
+    </w:p>
+    <w:p>
+      <w:pPr>
+        <w:jc w:val="center"/>
+      </w:pPr>
+      <w:r>
+        <w:rPr>
+          <w:i/>
+          <w:color w:val="555555"/>
+          <w:sz w:val="18"/>
+        </w:rPr>
+        <w:t>Figure 4. Positive controls — the model re-finds known drug-target axes (e.g. IL6ST, CTLA4, TNFRSF1A) from genetics alone, confirming the causal test is calibrated before any novel claim is made.</w:t>
+      </w:r>
+    </w:p>
+    <w:p>
       <w:r>
         <w:rPr>
           <w:b w:val="0"/>
@@ -2505,6 +2713,58 @@
       </w:r>
     </w:p>
     <w:p>
+      <w:pPr>
+        <w:jc w:val="center"/>
+      </w:pPr>
+      <w:r>
+        <w:drawing>
+          <wp:inline xmlns:a="http://schemas.openxmlformats.org/drawingml/2006/main" xmlns:pic="http://schemas.openxmlformats.org/drawingml/2006/picture">
+            <wp:extent cx="6035040" cy="3704027"/>
+            <wp:docPr id="5" name="Picture 5"/>
+            <wp:cNvGraphicFramePr>
+              <a:graphicFrameLocks noChangeAspect="1"/>
+            </wp:cNvGraphicFramePr>
+            <a:graphic>
+              <a:graphicData uri="http://schemas.openxmlformats.org/drawingml/2006/picture">
+                <pic:pic>
+                  <pic:nvPicPr>
+                    <pic:cNvPr id="0" name="Figure7_pqtl_confirmation.png"/>
+                    <pic:cNvPicPr/>
+                  </pic:nvPicPr>
+                  <pic:blipFill>
+                    <a:blip r:embed="rId13"/>
+                    <a:stretch>
+                      <a:fillRect/>
+                    </a:stretch>
+                  </pic:blipFill>
+                  <pic:spPr>
+                    <a:xfrm>
+                      <a:off x="0" y="0"/>
+                      <a:ext cx="6035040" cy="3704027"/>
+                    </a:xfrm>
+                    <a:prstGeom prst="rect"/>
+                  </pic:spPr>
+                </pic:pic>
+              </a:graphicData>
+            </a:graphic>
+          </wp:inline>
+        </w:drawing>
+      </w:r>
+    </w:p>
+    <w:p>
+      <w:pPr>
+        <w:jc w:val="center"/>
+      </w:pPr>
+      <w:r>
+        <w:rPr>
+          <w:i/>
+          <w:color w:val="555555"/>
+          <w:sz w:val="18"/>
+        </w:rPr>
+        <w:t>Figure 7. Protein-level confirmation — for a subset of targets an independent plasma pQTL (INTERVAL) agrees in direction and colocalizes, upgrading them from transcript-level to protein-level causal targets (the strongest tier).</w:t>
+      </w:r>
+    </w:p>
+    <w:p>
       <w:r>
         <w:rPr>
           <w:b w:val="0"/>
@@ -2584,6 +2844,58 @@
       </w:r>
     </w:p>
     <w:p>
+      <w:pPr>
+        <w:jc w:val="center"/>
+      </w:pPr>
+      <w:r>
+        <w:drawing>
+          <wp:inline xmlns:a="http://schemas.openxmlformats.org/drawingml/2006/main" xmlns:pic="http://schemas.openxmlformats.org/drawingml/2006/picture">
+            <wp:extent cx="6035040" cy="3145278"/>
+            <wp:docPr id="6" name="Picture 6"/>
+            <wp:cNvGraphicFramePr>
+              <a:graphicFrameLocks noChangeAspect="1"/>
+            </wp:cNvGraphicFramePr>
+            <a:graphic>
+              <a:graphicData uri="http://schemas.openxmlformats.org/drawingml/2006/picture">
+                <pic:pic>
+                  <pic:nvPicPr>
+                    <pic:cNvPr id="0" name="Figure11_phenome_volcano.png"/>
+                    <pic:cNvPicPr/>
+                  </pic:nvPicPr>
+                  <pic:blipFill>
+                    <a:blip r:embed="rId14"/>
+                    <a:stretch>
+                      <a:fillRect/>
+                    </a:stretch>
+                  </pic:blipFill>
+                  <pic:spPr>
+                    <a:xfrm>
+                      <a:off x="0" y="0"/>
+                      <a:ext cx="6035040" cy="3145278"/>
+                    </a:xfrm>
+                    <a:prstGeom prst="rect"/>
+                  </pic:spPr>
+                </pic:pic>
+              </a:graphicData>
+            </a:graphic>
+          </wp:inline>
+        </w:drawing>
+      </w:r>
+    </w:p>
+    <w:p>
+      <w:pPr>
+        <w:jc w:val="center"/>
+      </w:pPr>
+      <w:r>
+        <w:rPr>
+          <w:i/>
+          <w:color w:val="555555"/>
+          <w:sz w:val="18"/>
+        </w:rPr>
+        <w:t>Figure 11. Pan-phenome causal map — every immune protein tested against 28 diseases in 5 categories; each dot is a gene–disease test, height = significance. The spread shows the atlas reaches far beyond autoimmunity.</w:t>
+      </w:r>
+    </w:p>
+    <w:p>
       <w:r>
         <w:rPr>
           <w:b w:val="0"/>
@@ -2605,6 +2917,162 @@
       </w:r>
     </w:p>
     <w:p>
+      <w:pPr>
+        <w:jc w:val="center"/>
+      </w:pPr>
+      <w:r>
+        <w:drawing>
+          <wp:inline xmlns:a="http://schemas.openxmlformats.org/drawingml/2006/main" xmlns:pic="http://schemas.openxmlformats.org/drawingml/2006/picture">
+            <wp:extent cx="5852160" cy="4895203"/>
+            <wp:docPr id="7" name="Picture 7"/>
+            <wp:cNvGraphicFramePr>
+              <a:graphicFrameLocks noChangeAspect="1"/>
+            </wp:cNvGraphicFramePr>
+            <a:graphic>
+              <a:graphicData uri="http://schemas.openxmlformats.org/drawingml/2006/picture">
+                <pic:pic>
+                  <pic:nvPicPr>
+                    <pic:cNvPr id="0" name="Figure12_pleiotropy_heatmap.png"/>
+                    <pic:cNvPicPr/>
+                  </pic:nvPicPr>
+                  <pic:blipFill>
+                    <a:blip r:embed="rId15"/>
+                    <a:stretch>
+                      <a:fillRect/>
+                    </a:stretch>
+                  </pic:blipFill>
+                  <pic:spPr>
+                    <a:xfrm>
+                      <a:off x="0" y="0"/>
+                      <a:ext cx="5852160" cy="4895203"/>
+                    </a:xfrm>
+                    <a:prstGeom prst="rect"/>
+                  </pic:spPr>
+                </pic:pic>
+              </a:graphicData>
+            </a:graphic>
+          </wp:inline>
+        </w:drawing>
+      </w:r>
+    </w:p>
+    <w:p>
+      <w:pPr>
+        <w:jc w:val="center"/>
+      </w:pPr>
+      <w:r>
+        <w:rPr>
+          <w:i/>
+          <w:color w:val="555555"/>
+          <w:sz w:val="18"/>
+        </w:rPr>
+        <w:t>Figure 12. Shared immune axes — proteins causal in more than one disease category (e.g. IFNGR2, SWAP70, MERTK), i.e. where one immune target could matter across several diseases at once.</w:t>
+      </w:r>
+    </w:p>
+    <w:p>
+      <w:pPr>
+        <w:jc w:val="center"/>
+      </w:pPr>
+      <w:r>
+        <w:drawing>
+          <wp:inline xmlns:a="http://schemas.openxmlformats.org/drawingml/2006/main" xmlns:pic="http://schemas.openxmlformats.org/drawingml/2006/picture">
+            <wp:extent cx="5852160" cy="2492014"/>
+            <wp:docPr id="8" name="Picture 8"/>
+            <wp:cNvGraphicFramePr>
+              <a:graphicFrameLocks noChangeAspect="1"/>
+            </wp:cNvGraphicFramePr>
+            <a:graphic>
+              <a:graphicData uri="http://schemas.openxmlformats.org/drawingml/2006/picture">
+                <pic:pic>
+                  <pic:nvPicPr>
+                    <pic:cNvPr id="0" name="Figure13_cellsource_map.png"/>
+                    <pic:cNvPicPr/>
+                  </pic:nvPicPr>
+                  <pic:blipFill>
+                    <a:blip r:embed="rId16"/>
+                    <a:stretch>
+                      <a:fillRect/>
+                    </a:stretch>
+                  </pic:blipFill>
+                  <pic:spPr>
+                    <a:xfrm>
+                      <a:off x="0" y="0"/>
+                      <a:ext cx="5852160" cy="2492014"/>
+                    </a:xfrm>
+                    <a:prstGeom prst="rect"/>
+                  </pic:spPr>
+                </pic:pic>
+              </a:graphicData>
+            </a:graphic>
+          </wp:inline>
+        </w:drawing>
+      </w:r>
+    </w:p>
+    <w:p>
+      <w:pPr>
+        <w:jc w:val="center"/>
+      </w:pPr>
+      <w:r>
+        <w:rPr>
+          <w:i/>
+          <w:color w:val="555555"/>
+          <w:sz w:val="18"/>
+        </w:rPr>
+        <w:t>Figure 13. Which blood cells make the causal proteins — mapping each target back to its immune-cell source (e.g. granulocyte, T-cell), pointing to the cell type to study or perturb.</w:t>
+      </w:r>
+    </w:p>
+    <w:p>
+      <w:pPr>
+        <w:jc w:val="center"/>
+      </w:pPr>
+      <w:r>
+        <w:drawing>
+          <wp:inline xmlns:a="http://schemas.openxmlformats.org/drawingml/2006/main" xmlns:pic="http://schemas.openxmlformats.org/drawingml/2006/picture">
+            <wp:extent cx="5852160" cy="30158656"/>
+            <wp:docPr id="9" name="Picture 9"/>
+            <wp:cNvGraphicFramePr>
+              <a:graphicFrameLocks noChangeAspect="1"/>
+            </wp:cNvGraphicFramePr>
+            <a:graphic>
+              <a:graphicData uri="http://schemas.openxmlformats.org/drawingml/2006/picture">
+                <pic:pic>
+                  <pic:nvPicPr>
+                    <pic:cNvPr id="0" name="Figure14_direction_map.png"/>
+                    <pic:cNvPicPr/>
+                  </pic:nvPicPr>
+                  <pic:blipFill>
+                    <a:blip r:embed="rId17"/>
+                    <a:stretch>
+                      <a:fillRect/>
+                    </a:stretch>
+                  </pic:blipFill>
+                  <pic:spPr>
+                    <a:xfrm>
+                      <a:off x="0" y="0"/>
+                      <a:ext cx="5852160" cy="30158656"/>
+                    </a:xfrm>
+                    <a:prstGeom prst="rect"/>
+                  </pic:spPr>
+                </pic:pic>
+              </a:graphicData>
+            </a:graphic>
+          </wp:inline>
+        </w:drawing>
+      </w:r>
+    </w:p>
+    <w:p>
+      <w:pPr>
+        <w:jc w:val="center"/>
+      </w:pPr>
+      <w:r>
+        <w:rPr>
+          <w:i/>
+          <w:color w:val="555555"/>
+          <w:sz w:val="18"/>
+        </w:rPr>
+        <w:t>Figure 14. Block or boost? — for each causal target, whether higher protein raises risk (red = block it) or is protective (green = agonize/replace it). This is the therapeutic-direction readout.</w:t>
+      </w:r>
+    </w:p>
+    <w:p>
       <w:r>
         <w:rPr>
           <w:b w:val="0"/>
@@ -2626,6 +3094,110 @@
       </w:r>
     </w:p>
     <w:p>
+      <w:pPr>
+        <w:jc w:val="center"/>
+      </w:pPr>
+      <w:r>
+        <w:drawing>
+          <wp:inline xmlns:a="http://schemas.openxmlformats.org/drawingml/2006/main" xmlns:pic="http://schemas.openxmlformats.org/drawingml/2006/picture">
+            <wp:extent cx="6035040" cy="4901855"/>
+            <wp:docPr id="10" name="Picture 10"/>
+            <wp:cNvGraphicFramePr>
+              <a:graphicFrameLocks noChangeAspect="1"/>
+            </wp:cNvGraphicFramePr>
+            <a:graphic>
+              <a:graphicData uri="http://schemas.openxmlformats.org/drawingml/2006/picture">
+                <pic:pic>
+                  <pic:nvPicPr>
+                    <pic:cNvPr id="0" name="Figure15_novelty_ranking.png"/>
+                    <pic:cNvPicPr/>
+                  </pic:nvPicPr>
+                  <pic:blipFill>
+                    <a:blip r:embed="rId18"/>
+                    <a:stretch>
+                      <a:fillRect/>
+                    </a:stretch>
+                  </pic:blipFill>
+                  <pic:spPr>
+                    <a:xfrm>
+                      <a:off x="0" y="0"/>
+                      <a:ext cx="6035040" cy="4901855"/>
+                    </a:xfrm>
+                    <a:prstGeom prst="rect"/>
+                  </pic:spPr>
+                </pic:pic>
+              </a:graphicData>
+            </a:graphic>
+          </wp:inline>
+        </w:drawing>
+      </w:r>
+    </w:p>
+    <w:p>
+      <w:pPr>
+        <w:jc w:val="center"/>
+      </w:pPr>
+      <w:r>
+        <w:rPr>
+          <w:i/>
+          <w:color w:val="555555"/>
+          <w:sz w:val="18"/>
+        </w:rPr>
+        <w:t>Figure 15. Ranked novel targets — the engine scores every target by stacked evidence while penalising known-drug and MHC signals, so the top of the list is genuinely new, druggable immune targets (e.g. ACE, IFNGR2, ERBB3, PLAUR).</w:t>
+      </w:r>
+    </w:p>
+    <w:p>
+      <w:pPr>
+        <w:jc w:val="center"/>
+      </w:pPr>
+      <w:r>
+        <w:drawing>
+          <wp:inline xmlns:a="http://schemas.openxmlformats.org/drawingml/2006/main" xmlns:pic="http://schemas.openxmlformats.org/drawingml/2006/picture">
+            <wp:extent cx="6035040" cy="2782953"/>
+            <wp:docPr id="11" name="Picture 11"/>
+            <wp:cNvGraphicFramePr>
+              <a:graphicFrameLocks noChangeAspect="1"/>
+            </wp:cNvGraphicFramePr>
+            <a:graphic>
+              <a:graphicData uri="http://schemas.openxmlformats.org/drawingml/2006/picture">
+                <pic:pic>
+                  <pic:nvPicPr>
+                    <pic:cNvPr id="0" name="Figure16_novelty_evidence.png"/>
+                    <pic:cNvPicPr/>
+                  </pic:nvPicPr>
+                  <pic:blipFill>
+                    <a:blip r:embed="rId19"/>
+                    <a:stretch>
+                      <a:fillRect/>
+                    </a:stretch>
+                  </pic:blipFill>
+                  <pic:spPr>
+                    <a:xfrm>
+                      <a:off x="0" y="0"/>
+                      <a:ext cx="6035040" cy="2782953"/>
+                    </a:xfrm>
+                    <a:prstGeom prst="rect"/>
+                  </pic:spPr>
+                </pic:pic>
+              </a:graphicData>
+            </a:graphic>
+          </wp:inline>
+        </w:drawing>
+      </w:r>
+    </w:p>
+    <w:p>
+      <w:pPr>
+        <w:jc w:val="center"/>
+      </w:pPr>
+      <w:r>
+        <w:rPr>
+          <w:i/>
+          <w:color w:val="555555"/>
+          <w:sz w:val="18"/>
+        </w:rPr>
+        <w:t>Figure 16. Evidence behind the ranking — for the leading targets, the individual layers (causal strength, colocalization, pleiotropy, druggability) that add up to the novelty score.</w:t>
+      </w:r>
+    </w:p>
+    <w:p>
       <w:r>
         <w:rPr>
           <w:b w:val="0"/>
@@ -2675,6 +3247,58 @@
       </w:r>
     </w:p>
     <w:p>
+      <w:pPr>
+        <w:jc w:val="center"/>
+      </w:pPr>
+      <w:r>
+        <w:drawing>
+          <wp:inline xmlns:a="http://schemas.openxmlformats.org/drawingml/2006/main" xmlns:pic="http://schemas.openxmlformats.org/drawingml/2006/picture">
+            <wp:extent cx="6126480" cy="3529939"/>
+            <wp:docPr id="12" name="Picture 12"/>
+            <wp:cNvGraphicFramePr>
+              <a:graphicFrameLocks noChangeAspect="1"/>
+            </wp:cNvGraphicFramePr>
+            <a:graphic>
+              <a:graphicData uri="http://schemas.openxmlformats.org/drawingml/2006/picture">
+                <pic:pic>
+                  <pic:nvPicPr>
+                    <pic:cNvPr id="0" name="IL_panelA_workflow.png"/>
+                    <pic:cNvPicPr/>
+                  </pic:nvPicPr>
+                  <pic:blipFill>
+                    <a:blip r:embed="rId20"/>
+                    <a:stretch>
+                      <a:fillRect/>
+                    </a:stretch>
+                  </pic:blipFill>
+                  <pic:spPr>
+                    <a:xfrm>
+                      <a:off x="0" y="0"/>
+                      <a:ext cx="6126480" cy="3529939"/>
+                    </a:xfrm>
+                    <a:prstGeom prst="rect"/>
+                  </pic:spPr>
+                </pic:pic>
+              </a:graphicData>
+            </a:graphic>
+          </wp:inline>
+        </w:drawing>
+      </w:r>
+    </w:p>
+    <w:p>
+      <w:pPr>
+        <w:jc w:val="center"/>
+      </w:pPr>
+      <w:r>
+        <w:rPr>
+          <w:i/>
+          <w:color w:val="555555"/>
+          <w:sz w:val="18"/>
+        </w:rPr>
+        <w:t>Figure H1. From plasma sample to decision — the predictive PIRS answers WHO is at risk and WHICH proteins carry the signal; the causal atlas answers WHETHER a protein is causal and druggable. The intelligence layer fuses both.</w:t>
+      </w:r>
+    </w:p>
+    <w:p>
       <w:r>
         <w:rPr>
           <w:b w:val="0"/>
@@ -3348,6 +3972,110 @@
     </w:p>
     <w:p>
       <w:pPr>
+        <w:jc w:val="center"/>
+      </w:pPr>
+      <w:r>
+        <w:drawing>
+          <wp:inline xmlns:a="http://schemas.openxmlformats.org/drawingml/2006/main" xmlns:pic="http://schemas.openxmlformats.org/drawingml/2006/picture">
+            <wp:extent cx="6035040" cy="2992917"/>
+            <wp:docPr id="13" name="Picture 13"/>
+            <wp:cNvGraphicFramePr>
+              <a:graphicFrameLocks noChangeAspect="1"/>
+            </wp:cNvGraphicFramePr>
+            <a:graphic>
+              <a:graphicData uri="http://schemas.openxmlformats.org/drawingml/2006/picture">
+                <pic:pic>
+                  <pic:nvPicPr>
+                    <pic:cNvPr id="0" name="Figure8_replication.png"/>
+                    <pic:cNvPicPr/>
+                  </pic:nvPicPr>
+                  <pic:blipFill>
+                    <a:blip r:embed="rId21"/>
+                    <a:stretch>
+                      <a:fillRect/>
+                    </a:stretch>
+                  </pic:blipFill>
+                  <pic:spPr>
+                    <a:xfrm>
+                      <a:off x="0" y="0"/>
+                      <a:ext cx="6035040" cy="2992917"/>
+                    </a:xfrm>
+                    <a:prstGeom prst="rect"/>
+                  </pic:spPr>
+                </pic:pic>
+              </a:graphicData>
+            </a:graphic>
+          </wp:inline>
+        </w:drawing>
+      </w:r>
+    </w:p>
+    <w:p>
+      <w:pPr>
+        <w:jc w:val="center"/>
+      </w:pPr>
+      <w:r>
+        <w:rPr>
+          <w:i/>
+          <w:color w:val="555555"/>
+          <w:sz w:val="18"/>
+        </w:rPr>
+        <w:t>Figure 8. Independent replication — nominated targets are re-tested in separate, non-FinnGen disease GWAS (e.g. IMSGC, Okada). Points on the diagonal replicate in direction, showing the findings are not a single-cohort artefact.</w:t>
+      </w:r>
+    </w:p>
+    <w:p>
+      <w:pPr>
+        <w:jc w:val="center"/>
+      </w:pPr>
+      <w:r>
+        <w:drawing>
+          <wp:inline xmlns:a="http://schemas.openxmlformats.org/drawingml/2006/main" xmlns:pic="http://schemas.openxmlformats.org/drawingml/2006/picture">
+            <wp:extent cx="6035040" cy="3917937"/>
+            <wp:docPr id="14" name="Picture 14"/>
+            <wp:cNvGraphicFramePr>
+              <a:graphicFrameLocks noChangeAspect="1"/>
+            </wp:cNvGraphicFramePr>
+            <a:graphic>
+              <a:graphicData uri="http://schemas.openxmlformats.org/drawingml/2006/picture">
+                <pic:pic>
+                  <pic:nvPicPr>
+                    <pic:cNvPr id="0" name="Figure6_validation_roadmap.png"/>
+                    <pic:cNvPicPr/>
+                  </pic:nvPicPr>
+                  <pic:blipFill>
+                    <a:blip r:embed="rId22"/>
+                    <a:stretch>
+                      <a:fillRect/>
+                    </a:stretch>
+                  </pic:blipFill>
+                  <pic:spPr>
+                    <a:xfrm>
+                      <a:off x="0" y="0"/>
+                      <a:ext cx="6035040" cy="3917937"/>
+                    </a:xfrm>
+                    <a:prstGeom prst="rect"/>
+                  </pic:spPr>
+                </pic:pic>
+              </a:graphicData>
+            </a:graphic>
+          </wp:inline>
+        </w:drawing>
+      </w:r>
+    </w:p>
+    <w:p>
+      <w:pPr>
+        <w:jc w:val="center"/>
+      </w:pPr>
+      <w:r>
+        <w:rPr>
+          <w:i/>
+          <w:color w:val="555555"/>
+          <w:sz w:val="18"/>
+        </w:rPr>
+        <w:t>Figure 6. Validation roadmap — the ladder every target climbs: MR → colocalization → protein pQTL → replication → perturbation. A target’s evidence tier is simply how far up this ladder its data carry it.</w:t>
+      </w:r>
+    </w:p>
+    <w:p>
+      <w:pPr>
         <w:pStyle w:val="Heading2"/>
       </w:pPr>
       <w:r>
@@ -3507,6 +4235,58 @@
       </w:r>
     </w:p>
     <w:p>
+      <w:pPr>
+        <w:jc w:val="center"/>
+      </w:pPr>
+      <w:r>
+        <w:drawing>
+          <wp:inline xmlns:a="http://schemas.openxmlformats.org/drawingml/2006/main" xmlns:pic="http://schemas.openxmlformats.org/drawingml/2006/picture">
+            <wp:extent cx="5943600" cy="6110297"/>
+            <wp:docPr id="15" name="Picture 15"/>
+            <wp:cNvGraphicFramePr>
+              <a:graphicFrameLocks noChangeAspect="1"/>
+            </wp:cNvGraphicFramePr>
+            <a:graphic>
+              <a:graphicData uri="http://schemas.openxmlformats.org/drawingml/2006/picture">
+                <pic:pic>
+                  <pic:nvPicPr>
+                    <pic:cNvPr id="0" name="PFig_forest_Autoimmune.png"/>
+                    <pic:cNvPicPr/>
+                  </pic:nvPicPr>
+                  <pic:blipFill>
+                    <a:blip r:embed="rId23"/>
+                    <a:stretch>
+                      <a:fillRect/>
+                    </a:stretch>
+                  </pic:blipFill>
+                  <pic:spPr>
+                    <a:xfrm>
+                      <a:off x="0" y="0"/>
+                      <a:ext cx="5943600" cy="6110297"/>
+                    </a:xfrm>
+                    <a:prstGeom prst="rect"/>
+                  </pic:spPr>
+                </pic:pic>
+              </a:graphicData>
+            </a:graphic>
+          </wp:inline>
+        </w:drawing>
+      </w:r>
+    </w:p>
+    <w:p>
+      <w:pPr>
+        <w:jc w:val="center"/>
+      </w:pPr>
+      <w:r>
+        <w:rPr>
+          <w:i/>
+          <w:color w:val="555555"/>
+          <w:sz w:val="18"/>
+        </w:rPr>
+        <w:t>Figure K1. Autoimmune targets — forest plot of causal effects; left of the line = protective, right = risk. Each row is a plasma immune protein with its odds ratio and confidence interval.</w:t>
+      </w:r>
+    </w:p>
+    <w:p>
       <w:r>
         <w:rPr>
           <w:b w:val="0"/>
@@ -4243,6 +5023,58 @@
       </w:r>
     </w:p>
     <w:p>
+      <w:pPr>
+        <w:jc w:val="center"/>
+      </w:pPr>
+      <w:r>
+        <w:drawing>
+          <wp:inline xmlns:a="http://schemas.openxmlformats.org/drawingml/2006/main" xmlns:pic="http://schemas.openxmlformats.org/drawingml/2006/picture">
+            <wp:extent cx="5943600" cy="6104393"/>
+            <wp:docPr id="16" name="Picture 16"/>
+            <wp:cNvGraphicFramePr>
+              <a:graphicFrameLocks noChangeAspect="1"/>
+            </wp:cNvGraphicFramePr>
+            <a:graphic>
+              <a:graphicData uri="http://schemas.openxmlformats.org/drawingml/2006/picture">
+                <pic:pic>
+                  <pic:nvPicPr>
+                    <pic:cNvPr id="0" name="PFig_forest_Cardiovascular.png"/>
+                    <pic:cNvPicPr/>
+                  </pic:nvPicPr>
+                  <pic:blipFill>
+                    <a:blip r:embed="rId24"/>
+                    <a:stretch>
+                      <a:fillRect/>
+                    </a:stretch>
+                  </pic:blipFill>
+                  <pic:spPr>
+                    <a:xfrm>
+                      <a:off x="0" y="0"/>
+                      <a:ext cx="5943600" cy="6104393"/>
+                    </a:xfrm>
+                    <a:prstGeom prst="rect"/>
+                  </pic:spPr>
+                </pic:pic>
+              </a:graphicData>
+            </a:graphic>
+          </wp:inline>
+        </w:drawing>
+      </w:r>
+    </w:p>
+    <w:p>
+      <w:pPr>
+        <w:jc w:val="center"/>
+      </w:pPr>
+      <w:r>
+        <w:rPr>
+          <w:i/>
+          <w:color w:val="555555"/>
+          <w:sz w:val="18"/>
+        </w:rPr>
+        <w:t>Figure K2. Cardiovascular targets — forest plot including ACE (the ACE-inhibitor target), PLAUR and SCARB1. Right of the line = raises risk (block); left = protective (agonize/replace).</w:t>
+      </w:r>
+    </w:p>
+    <w:p>
       <w:r>
         <w:rPr>
           <w:b w:val="0"/>
@@ -4589,6 +5421,58 @@
       </w:r>
     </w:p>
     <w:p>
+      <w:pPr>
+        <w:jc w:val="center"/>
+      </w:pPr>
+      <w:r>
+        <w:drawing>
+          <wp:inline xmlns:a="http://schemas.openxmlformats.org/drawingml/2006/main" xmlns:pic="http://schemas.openxmlformats.org/drawingml/2006/picture">
+            <wp:extent cx="5943600" cy="6110297"/>
+            <wp:docPr id="17" name="Picture 17"/>
+            <wp:cNvGraphicFramePr>
+              <a:graphicFrameLocks noChangeAspect="1"/>
+            </wp:cNvGraphicFramePr>
+            <a:graphic>
+              <a:graphicData uri="http://schemas.openxmlformats.org/drawingml/2006/picture">
+                <pic:pic>
+                  <pic:nvPicPr>
+                    <pic:cNvPr id="0" name="PFig_forest_Metabolic.png"/>
+                    <pic:cNvPicPr/>
+                  </pic:nvPicPr>
+                  <pic:blipFill>
+                    <a:blip r:embed="rId25"/>
+                    <a:stretch>
+                      <a:fillRect/>
+                    </a:stretch>
+                  </pic:blipFill>
+                  <pic:spPr>
+                    <a:xfrm>
+                      <a:off x="0" y="0"/>
+                      <a:ext cx="5943600" cy="6110297"/>
+                    </a:xfrm>
+                    <a:prstGeom prst="rect"/>
+                  </pic:spPr>
+                </pic:pic>
+              </a:graphicData>
+            </a:graphic>
+          </wp:inline>
+        </w:drawing>
+      </w:r>
+    </w:p>
+    <w:p>
+      <w:pPr>
+        <w:jc w:val="center"/>
+      </w:pPr>
+      <w:r>
+        <w:rPr>
+          <w:i/>
+          <w:color w:val="555555"/>
+          <w:sz w:val="18"/>
+        </w:rPr>
+        <w:t>Figure K3. Metabolic targets — forest plot for type-1/2 diabetes, obesity and related endpoints (e.g. ERBB3, IL2RA, SPINK8).</w:t>
+      </w:r>
+    </w:p>
+    <w:p>
       <w:r>
         <w:rPr>
           <w:b/>
@@ -4795,6 +5679,58 @@
       </w:r>
     </w:p>
     <w:p>
+      <w:pPr>
+        <w:jc w:val="center"/>
+      </w:pPr>
+      <w:r>
+        <w:drawing>
+          <wp:inline xmlns:a="http://schemas.openxmlformats.org/drawingml/2006/main" xmlns:pic="http://schemas.openxmlformats.org/drawingml/2006/picture">
+            <wp:extent cx="5943600" cy="6104393"/>
+            <wp:docPr id="18" name="Picture 18"/>
+            <wp:cNvGraphicFramePr>
+              <a:graphicFrameLocks noChangeAspect="1"/>
+            </wp:cNvGraphicFramePr>
+            <a:graphic>
+              <a:graphicData uri="http://schemas.openxmlformats.org/drawingml/2006/picture">
+                <pic:pic>
+                  <pic:nvPicPr>
+                    <pic:cNvPr id="0" name="PFig_forest_Neuro_Aging.png"/>
+                    <pic:cNvPicPr/>
+                  </pic:nvPicPr>
+                  <pic:blipFill>
+                    <a:blip r:embed="rId26"/>
+                    <a:stretch>
+                      <a:fillRect/>
+                    </a:stretch>
+                  </pic:blipFill>
+                  <pic:spPr>
+                    <a:xfrm>
+                      <a:off x="0" y="0"/>
+                      <a:ext cx="5943600" cy="6104393"/>
+                    </a:xfrm>
+                    <a:prstGeom prst="rect"/>
+                  </pic:spPr>
+                </pic:pic>
+              </a:graphicData>
+            </a:graphic>
+          </wp:inline>
+        </w:drawing>
+      </w:r>
+    </w:p>
+    <w:p>
+      <w:pPr>
+        <w:jc w:val="center"/>
+      </w:pPr>
+      <w:r>
+        <w:rPr>
+          <w:i/>
+          <w:color w:val="555555"/>
+          <w:sz w:val="18"/>
+        </w:rPr>
+        <w:t>Figure K4. Neuro/aging targets — forest plot for dementia, Alzheimer’s, epilepsy and glaucoma (e.g. ACE, LYPD3, PVR).</w:t>
+      </w:r>
+    </w:p>
+    <w:p>
       <w:r>
         <w:rPr>
           <w:b/>
@@ -5063,6 +5999,58 @@
           <w:color w:val="2E629E"/>
         </w:rPr>
         <w:t>K.5  Renal disease</w:t>
+      </w:r>
+    </w:p>
+    <w:p>
+      <w:pPr>
+        <w:jc w:val="center"/>
+      </w:pPr>
+      <w:r>
+        <w:drawing>
+          <wp:inline xmlns:a="http://schemas.openxmlformats.org/drawingml/2006/main" xmlns:pic="http://schemas.openxmlformats.org/drawingml/2006/picture">
+            <wp:extent cx="5943600" cy="2342984"/>
+            <wp:docPr id="19" name="Picture 19"/>
+            <wp:cNvGraphicFramePr>
+              <a:graphicFrameLocks noChangeAspect="1"/>
+            </wp:cNvGraphicFramePr>
+            <a:graphic>
+              <a:graphicData uri="http://schemas.openxmlformats.org/drawingml/2006/picture">
+                <pic:pic>
+                  <pic:nvPicPr>
+                    <pic:cNvPr id="0" name="PFig_forest_Renal.png"/>
+                    <pic:cNvPicPr/>
+                  </pic:nvPicPr>
+                  <pic:blipFill>
+                    <a:blip r:embed="rId27"/>
+                    <a:stretch>
+                      <a:fillRect/>
+                    </a:stretch>
+                  </pic:blipFill>
+                  <pic:spPr>
+                    <a:xfrm>
+                      <a:off x="0" y="0"/>
+                      <a:ext cx="5943600" cy="2342984"/>
+                    </a:xfrm>
+                    <a:prstGeom prst="rect"/>
+                  </pic:spPr>
+                </pic:pic>
+              </a:graphicData>
+            </a:graphic>
+          </wp:inline>
+        </w:drawing>
+      </w:r>
+    </w:p>
+    <w:p>
+      <w:pPr>
+        <w:jc w:val="center"/>
+      </w:pPr>
+      <w:r>
+        <w:rPr>
+          <w:i/>
+          <w:color w:val="555555"/>
+          <w:sz w:val="18"/>
+        </w:rPr>
+        <w:t>Figure K5. Renal targets — forest plot for chronic kidney disease.</w:t>
       </w:r>
     </w:p>
     <w:p>
@@ -5759,6 +6747,58 @@
       </w:r>
     </w:p>
     <w:p>
+      <w:pPr>
+        <w:jc w:val="center"/>
+      </w:pPr>
+      <w:r>
+        <w:drawing>
+          <wp:inline xmlns:a="http://schemas.openxmlformats.org/drawingml/2006/main" xmlns:pic="http://schemas.openxmlformats.org/drawingml/2006/picture">
+            <wp:extent cx="5760720" cy="3584448"/>
+            <wp:docPr id="20" name="Picture 20"/>
+            <wp:cNvGraphicFramePr>
+              <a:graphicFrameLocks noChangeAspect="1"/>
+            </wp:cNvGraphicFramePr>
+            <a:graphic>
+              <a:graphicData uri="http://schemas.openxmlformats.org/drawingml/2006/picture">
+                <pic:pic>
+                  <pic:nvPicPr>
+                    <pic:cNvPr id="0" name="IL_panelB_performance.png"/>
+                    <pic:cNvPicPr/>
+                  </pic:nvPicPr>
+                  <pic:blipFill>
+                    <a:blip r:embed="rId28"/>
+                    <a:stretch>
+                      <a:fillRect/>
+                    </a:stretch>
+                  </pic:blipFill>
+                  <pic:spPr>
+                    <a:xfrm>
+                      <a:off x="0" y="0"/>
+                      <a:ext cx="5760720" cy="3584448"/>
+                    </a:xfrm>
+                    <a:prstGeom prst="rect"/>
+                  </pic:spPr>
+                </pic:pic>
+              </a:graphicData>
+            </a:graphic>
+          </wp:inline>
+        </w:drawing>
+      </w:r>
+    </w:p>
+    <w:p>
+      <w:pPr>
+        <w:jc w:val="center"/>
+      </w:pPr>
+      <w:r>
+        <w:rPr>
+          <w:i/>
+          <w:color w:val="555555"/>
+          <w:sz w:val="18"/>
+        </w:rPr>
+        <w:t>Panel B. Disease-specific strength — when a PIRS is trained this shows its prediction accuracy per disease; with no cohort supplied (the shipped state) it shows the causal-signal strength instead, and never invents accuracy numbers.</w:t>
+      </w:r>
+    </w:p>
+    <w:p>
       <w:r>
         <w:rPr>
           <w:b w:val="0"/>
@@ -5780,6 +6820,58 @@
       </w:r>
     </w:p>
     <w:p>
+      <w:pPr>
+        <w:jc w:val="center"/>
+      </w:pPr>
+      <w:r>
+        <w:drawing>
+          <wp:inline xmlns:a="http://schemas.openxmlformats.org/drawingml/2006/main" xmlns:pic="http://schemas.openxmlformats.org/drawingml/2006/picture">
+            <wp:extent cx="5760720" cy="4114800"/>
+            <wp:docPr id="21" name="Picture 21"/>
+            <wp:cNvGraphicFramePr>
+              <a:graphicFrameLocks noChangeAspect="1"/>
+            </wp:cNvGraphicFramePr>
+            <a:graphic>
+              <a:graphicData uri="http://schemas.openxmlformats.org/drawingml/2006/picture">
+                <pic:pic>
+                  <pic:nvPicPr>
+                    <pic:cNvPr id="0" name="IL_panelD_concordance.png"/>
+                    <pic:cNvPicPr/>
+                  </pic:nvPicPr>
+                  <pic:blipFill>
+                    <a:blip r:embed="rId29"/>
+                    <a:stretch>
+                      <a:fillRect/>
+                    </a:stretch>
+                  </pic:blipFill>
+                  <pic:spPr>
+                    <a:xfrm>
+                      <a:off x="0" y="0"/>
+                      <a:ext cx="5760720" cy="4114800"/>
+                    </a:xfrm>
+                    <a:prstGeom prst="rect"/>
+                  </pic:spPr>
+                </pic:pic>
+              </a:graphicData>
+            </a:graphic>
+          </wp:inline>
+        </w:drawing>
+      </w:r>
+    </w:p>
+    <w:p>
+      <w:pPr>
+        <w:jc w:val="center"/>
+      </w:pPr>
+      <w:r>
+        <w:rPr>
+          <w:i/>
+          <w:color w:val="555555"/>
+          <w:sz w:val="18"/>
+        </w:rPr>
+        <w:t>Panel D. Concordance ladder — how many gene–disease pairs survive each added layer of evidence: MR → colocalization → protein pQTL → replication. Fewer but stronger targets remain at each step.</w:t>
+      </w:r>
+    </w:p>
+    <w:p>
       <w:r>
         <w:rPr>
           <w:b w:val="0"/>
@@ -5801,6 +6893,58 @@
       </w:r>
     </w:p>
     <w:p>
+      <w:pPr>
+        <w:jc w:val="center"/>
+      </w:pPr>
+      <w:r>
+        <w:drawing>
+          <wp:inline xmlns:a="http://schemas.openxmlformats.org/drawingml/2006/main" xmlns:pic="http://schemas.openxmlformats.org/drawingml/2006/picture">
+            <wp:extent cx="5760720" cy="4044761"/>
+            <wp:docPr id="22" name="Picture 22"/>
+            <wp:cNvGraphicFramePr>
+              <a:graphicFrameLocks noChangeAspect="1"/>
+            </wp:cNvGraphicFramePr>
+            <a:graphic>
+              <a:graphicData uri="http://schemas.openxmlformats.org/drawingml/2006/picture">
+                <pic:pic>
+                  <pic:nvPicPr>
+                    <pic:cNvPr id="0" name="IL_panelE_novelty_map.png"/>
+                    <pic:cNvPicPr/>
+                  </pic:nvPicPr>
+                  <pic:blipFill>
+                    <a:blip r:embed="rId30"/>
+                    <a:stretch>
+                      <a:fillRect/>
+                    </a:stretch>
+                  </pic:blipFill>
+                  <pic:spPr>
+                    <a:xfrm>
+                      <a:off x="0" y="0"/>
+                      <a:ext cx="5760720" cy="4044761"/>
+                    </a:xfrm>
+                    <a:prstGeom prst="rect"/>
+                  </pic:spPr>
+                </pic:pic>
+              </a:graphicData>
+            </a:graphic>
+          </wp:inline>
+        </w:drawing>
+      </w:r>
+    </w:p>
+    <w:p>
+      <w:pPr>
+        <w:jc w:val="center"/>
+      </w:pPr>
+      <w:r>
+        <w:rPr>
+          <w:i/>
+          <w:color w:val="555555"/>
+          <w:sz w:val="18"/>
+        </w:rPr>
+        <w:t>Panel E. Novelty-priority map — each target plotted by colocalization strength (x) versus novelty score (y), coloured by tier. Top-right = strongly colocalized and highly novel: the priority corner.</w:t>
+      </w:r>
+    </w:p>
+    <w:p>
       <w:r>
         <w:rPr>
           <w:b w:val="0"/>
@@ -5920,6 +7064,110 @@
           <w:color w:val="2E629E"/>
         </w:rPr>
         <w:t>M.5  Therapeutic direction and the Final Required Output Table</w:t>
+      </w:r>
+    </w:p>
+    <w:p>
+      <w:pPr>
+        <w:jc w:val="center"/>
+      </w:pPr>
+      <w:r>
+        <w:drawing>
+          <wp:inline xmlns:a="http://schemas.openxmlformats.org/drawingml/2006/main" xmlns:pic="http://schemas.openxmlformats.org/drawingml/2006/picture">
+            <wp:extent cx="5760720" cy="4096512"/>
+            <wp:docPr id="23" name="Picture 23"/>
+            <wp:cNvGraphicFramePr>
+              <a:graphicFrameLocks noChangeAspect="1"/>
+            </wp:cNvGraphicFramePr>
+            <a:graphic>
+              <a:graphicData uri="http://schemas.openxmlformats.org/drawingml/2006/picture">
+                <pic:pic>
+                  <pic:nvPicPr>
+                    <pic:cNvPr id="0" name="IL_panelC_signature.png"/>
+                    <pic:cNvPicPr/>
+                  </pic:nvPicPr>
+                  <pic:blipFill>
+                    <a:blip r:embed="rId31"/>
+                    <a:stretch>
+                      <a:fillRect/>
+                    </a:stretch>
+                  </pic:blipFill>
+                  <pic:spPr>
+                    <a:xfrm>
+                      <a:off x="0" y="0"/>
+                      <a:ext cx="5760720" cy="4096512"/>
+                    </a:xfrm>
+                    <a:prstGeom prst="rect"/>
+                  </pic:spPr>
+                </pic:pic>
+              </a:graphicData>
+            </a:graphic>
+          </wp:inline>
+        </w:drawing>
+      </w:r>
+    </w:p>
+    <w:p>
+      <w:pPr>
+        <w:jc w:val="center"/>
+      </w:pPr>
+      <w:r>
+        <w:rPr>
+          <w:i/>
+          <w:color w:val="555555"/>
+          <w:sz w:val="18"/>
+        </w:rPr>
+        <w:t>Panel C. Plasma immune signature — the high-novelty targets coloured by direction (red = block a risk protein, green = agonize/replace a protective one).</w:t>
+      </w:r>
+    </w:p>
+    <w:p>
+      <w:pPr>
+        <w:jc w:val="center"/>
+      </w:pPr>
+      <w:r>
+        <w:drawing>
+          <wp:inline xmlns:a="http://schemas.openxmlformats.org/drawingml/2006/main" xmlns:pic="http://schemas.openxmlformats.org/drawingml/2006/picture">
+            <wp:extent cx="5760720" cy="3692216"/>
+            <wp:docPr id="24" name="Picture 24"/>
+            <wp:cNvGraphicFramePr>
+              <a:graphicFrameLocks noChangeAspect="1"/>
+            </wp:cNvGraphicFramePr>
+            <a:graphic>
+              <a:graphicData uri="http://schemas.openxmlformats.org/drawingml/2006/picture">
+                <pic:pic>
+                  <pic:nvPicPr>
+                    <pic:cNvPr id="0" name="IL_panelF_validation.png"/>
+                    <pic:cNvPicPr/>
+                  </pic:nvPicPr>
+                  <pic:blipFill>
+                    <a:blip r:embed="rId32"/>
+                    <a:stretch>
+                      <a:fillRect/>
+                    </a:stretch>
+                  </pic:blipFill>
+                  <pic:spPr>
+                    <a:xfrm>
+                      <a:off x="0" y="0"/>
+                      <a:ext cx="5760720" cy="3692216"/>
+                    </a:xfrm>
+                    <a:prstGeom prst="rect"/>
+                  </pic:spPr>
+                </pic:pic>
+              </a:graphicData>
+            </a:graphic>
+          </wp:inline>
+        </w:drawing>
+      </w:r>
+    </w:p>
+    <w:p>
+      <w:pPr>
+        <w:jc w:val="center"/>
+      </w:pPr>
+      <w:r>
+        <w:rPr>
+          <w:i/>
+          <w:color w:val="555555"/>
+          <w:sz w:val="18"/>
+        </w:rPr>
+        <w:t>Panel F. Validation plan — for the leading novel targets, the single best next experiment to run, so the report ends with actionable steps, not just a list.</w:t>
       </w:r>
     </w:p>
     <w:p>
@@ -6540,7 +7788,7 @@
         <w:drawing>
           <wp:inline xmlns:a="http://schemas.openxmlformats.org/drawingml/2006/main" xmlns:pic="http://schemas.openxmlformats.org/drawingml/2006/picture">
             <wp:extent cx="6126480" cy="3904059"/>
-            <wp:docPr id="1" name="Picture 1"/>
+            <wp:docPr id="25" name="Picture 25"/>
             <wp:cNvGraphicFramePr>
               <a:graphicFrameLocks noChangeAspect="1"/>
             </wp:cNvGraphicFramePr>
@@ -6552,7 +7800,7 @@
                     <pic:cNvPicPr/>
                   </pic:nvPicPr>
                   <pic:blipFill>
-                    <a:blip r:embed="rId9"/>
+                    <a:blip r:embed="rId33"/>
                     <a:stretch>
                       <a:fillRect/>
                     </a:stretch>

</xml_diff>